<commit_message>
created system context diagram
</commit_message>
<xml_diff>
--- a/SDS Document Code.docx
+++ b/SDS Document Code.docx
@@ -36492,6 +36492,370 @@
     <w:p>
       <w:r>
         <w:t xml:space="preserve">  which then writes immutable records to AuditLogDB.</w:t>
+      </w:r>
+    </w:p>
+    <w:p>
+      <w:r>
+        <w:t>end note</w:t>
+      </w:r>
+    </w:p>
+    <w:p/>
+    <w:p>
+      <w:r>
+        <w:t>@enduml</w:t>
+      </w:r>
+    </w:p>
+    <w:p>
+      <w:pPr>
+        <w:pStyle w:val="Heading1"/>
+      </w:pPr>
+      <w:r>
+        <w:lastRenderedPageBreak/>
+        <w:t>System Context Diagram:</w:t>
+      </w:r>
+    </w:p>
+    <w:p>
+      <w:r>
+        <w:t>@startuml</w:t>
+      </w:r>
+    </w:p>
+    <w:p>
+      <w:r>
+        <w:t>!theme plain</w:t>
+      </w:r>
+    </w:p>
+    <w:p>
+      <w:r>
+        <w:t>title System Context Diagram – Delivery Platform System</w:t>
+      </w:r>
+    </w:p>
+    <w:p/>
+    <w:p>
+      <w:r>
+        <w:t>' ============================</w:t>
+      </w:r>
+    </w:p>
+    <w:p>
+      <w:r>
+        <w:t>' Actors (Human)</w:t>
+      </w:r>
+    </w:p>
+    <w:p>
+      <w:r>
+        <w:t>' ============================</w:t>
+      </w:r>
+    </w:p>
+    <w:p>
+      <w:r>
+        <w:t>actor "Customer" as Customer &lt;&lt;Human&gt;&gt;</w:t>
+      </w:r>
+    </w:p>
+    <w:p>
+      <w:r>
+        <w:t>actor "Rider" as Rider &lt;&lt;Human&gt;&gt;</w:t>
+      </w:r>
+    </w:p>
+    <w:p>
+      <w:r>
+        <w:t>actor "Client" as Client &lt;&lt;Human&gt;&gt;</w:t>
+      </w:r>
+    </w:p>
+    <w:p/>
+    <w:p>
+      <w:r>
+        <w:t>' ============================</w:t>
+      </w:r>
+    </w:p>
+    <w:p>
+      <w:r>
+        <w:t>' The System</w:t>
+      </w:r>
+    </w:p>
+    <w:p>
+      <w:r>
+        <w:t>' ============================</w:t>
+      </w:r>
+    </w:p>
+    <w:p>
+      <w:r>
+        <w:t>rectangle "Multi Stakeholder Order &amp;\nDelivery Platform" as System {</w:t>
+      </w:r>
+    </w:p>
+    <w:p>
+      <w:r>
+        <w:t xml:space="preserve">    note right of System</w:t>
+      </w:r>
+    </w:p>
+    <w:p>
+      <w:r>
+        <w:t xml:space="preserve">      Includes:</w:t>
+      </w:r>
+    </w:p>
+    <w:p>
+      <w:r>
+        <w:t xml:space="preserve">      - Mobile App (Rider/Customer)</w:t>
+      </w:r>
+    </w:p>
+    <w:p>
+      <w:r>
+        <w:t xml:space="preserve">      - Web App (Customer)</w:t>
+      </w:r>
+    </w:p>
+    <w:p>
+      <w:r>
+        <w:t xml:space="preserve">      - Admin Dashboard (Client)</w:t>
+      </w:r>
+    </w:p>
+    <w:p>
+      <w:r>
+        <w:t xml:space="preserve">      - Backend Microservices</w:t>
+      </w:r>
+    </w:p>
+    <w:p>
+      <w:r>
+        <w:t xml:space="preserve">      - API Gateway</w:t>
+      </w:r>
+    </w:p>
+    <w:p>
+      <w:r>
+        <w:t xml:space="preserve">    end note</w:t>
+      </w:r>
+    </w:p>
+    <w:p>
+      <w:r>
+        <w:t>}</w:t>
+      </w:r>
+    </w:p>
+    <w:p/>
+    <w:p>
+      <w:r>
+        <w:t>' ============================</w:t>
+      </w:r>
+    </w:p>
+    <w:p>
+      <w:r>
+        <w:t>' External Systems</w:t>
+      </w:r>
+    </w:p>
+    <w:p>
+      <w:r>
+        <w:t>' ============================</w:t>
+      </w:r>
+    </w:p>
+    <w:p>
+      <w:r>
+        <w:lastRenderedPageBreak/>
+        <w:t>actor "Google Maps API" as GoogleMaps &lt;&lt;External System&gt;&gt;</w:t>
+      </w:r>
+    </w:p>
+    <w:p>
+      <w:r>
+        <w:t>actor "Payment Gateway\n(Stripe/Easypaisa/Jazzcash)" as PaymentGW &lt;&lt;External System&gt;&gt;</w:t>
+      </w:r>
+    </w:p>
+    <w:p>
+      <w:r>
+        <w:t>actor "SMS/Email Providers\n(Twilio/SendGrid)" as NotifyProviders &lt;&lt;External System&gt;&gt;</w:t>
+      </w:r>
+    </w:p>
+    <w:p>
+      <w:r>
+        <w:t>actor "Cloud Storage\n(S3 / Spaces)" as CloudStorage &lt;&lt;External System&gt;&gt;</w:t>
+      </w:r>
+    </w:p>
+    <w:p/>
+    <w:p>
+      <w:r>
+        <w:t>' ============================</w:t>
+      </w:r>
+    </w:p>
+    <w:p>
+      <w:r>
+        <w:t>' Interactions</w:t>
+      </w:r>
+    </w:p>
+    <w:p>
+      <w:r>
+        <w:t>' ============================</w:t>
+      </w:r>
+    </w:p>
+    <w:p/>
+    <w:p>
+      <w:r>
+        <w:t>' Customers</w:t>
+      </w:r>
+    </w:p>
+    <w:p>
+      <w:r>
+        <w:t>Customer --&gt; System : Browse products, place orders,\nmake payments, track deliveries,\nfile complaints, manage wallet</w:t>
+      </w:r>
+    </w:p>
+    <w:p/>
+    <w:p>
+      <w:r>
+        <w:t>' Riders</w:t>
+      </w:r>
+    </w:p>
+    <w:p>
+      <w:r>
+        <w:t>Rider --&gt; System : Register, accept orders,\nfollow routes, update prices,\nhandle deliveries/returns,\nreport incidents</w:t>
+      </w:r>
+    </w:p>
+    <w:p/>
+    <w:p>
+      <w:r>
+        <w:t>' Clients</w:t>
+      </w:r>
+    </w:p>
+    <w:p>
+      <w:r>
+        <w:t>Client --&gt; System : Manage shops/products/bases,\napprove riders/clients,\nconfigure fees/discounts,\nview financial reports,\nhandle complaints/returns,\nmanage budgets/plans</w:t>
+      </w:r>
+    </w:p>
+    <w:p/>
+    <w:p>
+      <w:r>
+        <w:t>' External System Interactions</w:t>
+      </w:r>
+    </w:p>
+    <w:p>
+      <w:r>
+        <w:t>System --&gt; GoogleMaps : Geocoding, distance matrix,\nroute optimization, maps display</w:t>
+      </w:r>
+    </w:p>
+    <w:p>
+      <w:r>
+        <w:t>System --&gt; PaymentGW : Process payments, tokenize cards,\nhandle payouts (Easypaisa/Jazzcash)</w:t>
+      </w:r>
+    </w:p>
+    <w:p>
+      <w:r>
+        <w:t>System --&gt; NotifyProviders : Send SMS OTP, push notifications,\nemail alerts and receipts</w:t>
+      </w:r>
+    </w:p>
+    <w:p>
+      <w:r>
+        <w:t>System --&gt; CloudStorage : Store/retrieve images (products,\nID cards, bills, evidence, agreements)</w:t>
+      </w:r>
+    </w:p>
+    <w:p/>
+    <w:p>
+      <w:r>
+        <w:t>' ============================</w:t>
+      </w:r>
+    </w:p>
+    <w:p>
+      <w:r>
+        <w:t>' Notes</w:t>
+      </w:r>
+    </w:p>
+    <w:p>
+      <w:r>
+        <w:t>' ============================</w:t>
+      </w:r>
+    </w:p>
+    <w:p>
+      <w:r>
+        <w:lastRenderedPageBreak/>
+        <w:t>note right of Customer</w:t>
+      </w:r>
+    </w:p>
+    <w:p>
+      <w:r>
+        <w:t xml:space="preserve">  Uses Mobile App or Web App.</w:t>
+      </w:r>
+    </w:p>
+    <w:p>
+      <w:r>
+        <w:t xml:space="preserve">  May browse without login;</w:t>
+      </w:r>
+    </w:p>
+    <w:p>
+      <w:r>
+        <w:t xml:space="preserve">  must register/login to order.</w:t>
+      </w:r>
+    </w:p>
+    <w:p>
+      <w:r>
+        <w:t>end note</w:t>
+      </w:r>
+    </w:p>
+    <w:p/>
+    <w:p>
+      <w:r>
+        <w:t>note left of Rider</w:t>
+      </w:r>
+    </w:p>
+    <w:p>
+      <w:r>
+        <w:t xml:space="preserve">  Uses Mobile App only.</w:t>
+      </w:r>
+    </w:p>
+    <w:p>
+      <w:r>
+        <w:t xml:space="preserve">  Requires client approval to operate.</w:t>
+      </w:r>
+    </w:p>
+    <w:p>
+      <w:r>
+        <w:t xml:space="preserve">  Must be assigned to a base.</w:t>
+      </w:r>
+    </w:p>
+    <w:p>
+      <w:r>
+        <w:t>end note</w:t>
+      </w:r>
+    </w:p>
+    <w:p/>
+    <w:p>
+      <w:r>
+        <w:t>note right of Client</w:t>
+      </w:r>
+    </w:p>
+    <w:p>
+      <w:r>
+        <w:t xml:space="preserve">  Uses separate Admin Dashboard URL.</w:t>
+      </w:r>
+    </w:p>
+    <w:p>
+      <w:r>
+        <w:t xml:space="preserve">  Multiple clients with unanimous approval</w:t>
+      </w:r>
+    </w:p>
+    <w:p>
+      <w:r>
+        <w:t xml:space="preserve">  for configuration changes.</w:t>
+      </w:r>
+    </w:p>
+    <w:p>
+      <w:r>
+        <w:t>end note</w:t>
+      </w:r>
+    </w:p>
+    <w:p/>
+    <w:p>
+      <w:r>
+        <w:t>note bottom of System</w:t>
+      </w:r>
+    </w:p>
+    <w:p>
+      <w:r>
+        <w:t xml:space="preserve">  All communication over HTTPS (TLS 1.3).</w:t>
+      </w:r>
+    </w:p>
+    <w:p>
+      <w:r>
+        <w:t xml:space="preserve">  JWT-based authentication.</w:t>
+      </w:r>
+    </w:p>
+    <w:p>
+      <w:r>
+        <w:t xml:space="preserve">  Rate limiting applied.</w:t>
+      </w:r>
+    </w:p>
+    <w:p>
+      <w:r>
+        <w:t xml:space="preserve">  Data residency: Pakistan (NFR-21).</w:t>
       </w:r>
     </w:p>
     <w:p>

</xml_diff>

<commit_message>
created Microservice Architecture Diagram
</commit_message>
<xml_diff>
--- a/SDS Document Code.docx
+++ b/SDS Document Code.docx
@@ -36856,6 +36856,1472 @@
     <w:p>
       <w:r>
         <w:t xml:space="preserve">  Data residency: Pakistan (NFR-21).</w:t>
+      </w:r>
+    </w:p>
+    <w:p>
+      <w:r>
+        <w:t>end note</w:t>
+      </w:r>
+    </w:p>
+    <w:p/>
+    <w:p>
+      <w:r>
+        <w:t>@enduml</w:t>
+      </w:r>
+    </w:p>
+    <w:p>
+      <w:pPr>
+        <w:pStyle w:val="Heading1"/>
+      </w:pPr>
+      <w:r>
+        <w:t>Microservice Architecture Diagram:</w:t>
+      </w:r>
+    </w:p>
+    <w:p>
+      <w:r>
+        <w:t>@startuml</w:t>
+      </w:r>
+    </w:p>
+    <w:p>
+      <w:r>
+        <w:t>!theme plain</w:t>
+      </w:r>
+    </w:p>
+    <w:p>
+      <w:r>
+        <w:lastRenderedPageBreak/>
+        <w:t>scale 0.2</w:t>
+      </w:r>
+    </w:p>
+    <w:p>
+      <w:r>
+        <w:t>title Microservice Architecture Diagram – Delivery Platform System</w:t>
+      </w:r>
+    </w:p>
+    <w:p/>
+    <w:p>
+      <w:r>
+        <w:t>' ============================</w:t>
+      </w:r>
+    </w:p>
+    <w:p>
+      <w:r>
+        <w:t>' External Actors / Clients</w:t>
+      </w:r>
+    </w:p>
+    <w:p>
+      <w:r>
+        <w:t>' ============================</w:t>
+      </w:r>
+    </w:p>
+    <w:p>
+      <w:r>
+        <w:t>actor Customer as Cust</w:t>
+      </w:r>
+    </w:p>
+    <w:p>
+      <w:r>
+        <w:t>actor Rider as Rider</w:t>
+      </w:r>
+    </w:p>
+    <w:p>
+      <w:r>
+        <w:t>actor Client as Client</w:t>
+      </w:r>
+    </w:p>
+    <w:p/>
+    <w:p>
+      <w:r>
+        <w:t>' ============================</w:t>
+      </w:r>
+    </w:p>
+    <w:p>
+      <w:r>
+        <w:t>' API Gateway Layer</w:t>
+      </w:r>
+    </w:p>
+    <w:p>
+      <w:r>
+        <w:t>' ============================</w:t>
+      </w:r>
+    </w:p>
+    <w:p>
+      <w:r>
+        <w:t>package "API Gateway" {</w:t>
+      </w:r>
+    </w:p>
+    <w:p>
+      <w:r>
+        <w:t xml:space="preserve">    component "API Gateway\n(Spring Cloud Gateway)" as Gateway &lt;&lt;gateway&gt;&gt;</w:t>
+      </w:r>
+    </w:p>
+    <w:p>
+      <w:r>
+        <w:t xml:space="preserve">    note right of Gateway</w:t>
+      </w:r>
+    </w:p>
+    <w:p>
+      <w:r>
+        <w:t xml:space="preserve">      - JWT Validation (SEC-09)</w:t>
+      </w:r>
+    </w:p>
+    <w:p>
+      <w:r>
+        <w:t xml:space="preserve">      - Rate Limiting (SEC-25)</w:t>
+      </w:r>
+    </w:p>
+    <w:p>
+      <w:r>
+        <w:t xml:space="preserve">      - TLS Termination</w:t>
+      </w:r>
+    </w:p>
+    <w:p>
+      <w:r>
+        <w:t xml:space="preserve">      - WebSocket Routing</w:t>
+      </w:r>
+    </w:p>
+    <w:p>
+      <w:r>
+        <w:t xml:space="preserve">    end note</w:t>
+      </w:r>
+    </w:p>
+    <w:p>
+      <w:r>
+        <w:t>}</w:t>
+      </w:r>
+    </w:p>
+    <w:p/>
+    <w:p>
+      <w:r>
+        <w:t>' ============================</w:t>
+      </w:r>
+    </w:p>
+    <w:p>
+      <w:r>
+        <w:t>' Core Business Services</w:t>
+      </w:r>
+    </w:p>
+    <w:p>
+      <w:r>
+        <w:t>' ============================</w:t>
+      </w:r>
+    </w:p>
+    <w:p>
+      <w:r>
+        <w:t>package "Core Services" {</w:t>
+      </w:r>
+    </w:p>
+    <w:p>
+      <w:r>
+        <w:t xml:space="preserve">    </w:t>
+      </w:r>
+    </w:p>
+    <w:p>
+      <w:r>
+        <w:t xml:space="preserve">    component "Customer Service" as CustomerSvc &lt;&lt;microservice&gt;&gt; {</w:t>
+      </w:r>
+    </w:p>
+    <w:p>
+      <w:r>
+        <w:lastRenderedPageBreak/>
+        <w:t xml:space="preserve">        [Customer CRUD]</w:t>
+      </w:r>
+    </w:p>
+    <w:p>
+      <w:r>
+        <w:t xml:space="preserve">        [Wallet Management]</w:t>
+      </w:r>
+    </w:p>
+    <w:p>
+      <w:r>
+        <w:t xml:space="preserve">        [Authentication]</w:t>
+      </w:r>
+    </w:p>
+    <w:p>
+      <w:r>
+        <w:t xml:space="preserve">        [Wishlist]</w:t>
+      </w:r>
+    </w:p>
+    <w:p>
+      <w:r>
+        <w:t xml:space="preserve">    }</w:t>
+      </w:r>
+    </w:p>
+    <w:p>
+      <w:r>
+        <w:t xml:space="preserve">    </w:t>
+      </w:r>
+    </w:p>
+    <w:p>
+      <w:r>
+        <w:t xml:space="preserve">    component "Rider Service" as RiderSvc &lt;&lt;microservice&gt;&gt; {</w:t>
+      </w:r>
+    </w:p>
+    <w:p>
+      <w:r>
+        <w:t xml:space="preserve">        [Rider Registration]</w:t>
+      </w:r>
+    </w:p>
+    <w:p>
+      <w:r>
+        <w:t xml:space="preserve">        [Approval Workflow]</w:t>
+      </w:r>
+    </w:p>
+    <w:p>
+      <w:r>
+        <w:t xml:space="preserve">        [Carried Cash]</w:t>
+      </w:r>
+    </w:p>
+    <w:p>
+      <w:r>
+        <w:t xml:space="preserve">        [Vehicle &amp; Docs]</w:t>
+      </w:r>
+    </w:p>
+    <w:p>
+      <w:r>
+        <w:t xml:space="preserve">    }</w:t>
+      </w:r>
+    </w:p>
+    <w:p>
+      <w:r>
+        <w:t xml:space="preserve">    </w:t>
+      </w:r>
+    </w:p>
+    <w:p>
+      <w:r>
+        <w:t xml:space="preserve">    component "Order Service" as OrderSvc &lt;&lt;microservice&gt;&gt; {</w:t>
+      </w:r>
+    </w:p>
+    <w:p>
+      <w:r>
+        <w:t xml:space="preserve">        [Order Lifecycle]</w:t>
+      </w:r>
+    </w:p>
+    <w:p>
+      <w:r>
+        <w:t xml:space="preserve">        [Order Splitting]</w:t>
+      </w:r>
+    </w:p>
+    <w:p>
+      <w:r>
+        <w:t xml:space="preserve">        [Cart Management]</w:t>
+      </w:r>
+    </w:p>
+    <w:p>
+      <w:r>
+        <w:t xml:space="preserve">        [Order History]</w:t>
+      </w:r>
+    </w:p>
+    <w:p>
+      <w:r>
+        <w:t xml:space="preserve">    }</w:t>
+      </w:r>
+    </w:p>
+    <w:p>
+      <w:r>
+        <w:t xml:space="preserve">    </w:t>
+      </w:r>
+    </w:p>
+    <w:p>
+      <w:r>
+        <w:t xml:space="preserve">    component "Trip &amp; Route Service" as TripSvc &lt;&lt;microservice&gt;&gt; {</w:t>
+      </w:r>
+    </w:p>
+    <w:p>
+      <w:r>
+        <w:t xml:space="preserve">        [Route Optimization]</w:t>
+      </w:r>
+    </w:p>
+    <w:p>
+      <w:r>
+        <w:t xml:space="preserve">        [Trip Execution]</w:t>
+      </w:r>
+    </w:p>
+    <w:p>
+      <w:r>
+        <w:t xml:space="preserve">        [Fuel Cost Calc]</w:t>
+      </w:r>
+    </w:p>
+    <w:p>
+      <w:r>
+        <w:t xml:space="preserve">        [Live Location]</w:t>
+      </w:r>
+    </w:p>
+    <w:p>
+      <w:r>
+        <w:t xml:space="preserve">    }</w:t>
+      </w:r>
+    </w:p>
+    <w:p>
+      <w:r>
+        <w:t xml:space="preserve">    </w:t>
+      </w:r>
+    </w:p>
+    <w:p>
+      <w:r>
+        <w:t xml:space="preserve">    component "Dispatch &amp; Order\nAssignment Service" as DispatchSvc &lt;&lt;microservice&gt;&gt; {</w:t>
+      </w:r>
+    </w:p>
+    <w:p>
+      <w:r>
+        <w:t xml:space="preserve">        [Order Matching]</w:t>
+      </w:r>
+    </w:p>
+    <w:p>
+      <w:r>
+        <w:lastRenderedPageBreak/>
+        <w:t xml:space="preserve">        [Escalation]</w:t>
+      </w:r>
+    </w:p>
+    <w:p>
+      <w:r>
+        <w:t xml:space="preserve">        [Re-marketing]</w:t>
+      </w:r>
+    </w:p>
+    <w:p>
+      <w:r>
+        <w:t xml:space="preserve">    }</w:t>
+      </w:r>
+    </w:p>
+    <w:p>
+      <w:r>
+        <w:t xml:space="preserve">    </w:t>
+      </w:r>
+    </w:p>
+    <w:p>
+      <w:r>
+        <w:t xml:space="preserve">    component "Product &amp; Shop Service" as ProductSvc &lt;&lt;microservice&gt;&gt; {</w:t>
+      </w:r>
+    </w:p>
+    <w:p>
+      <w:r>
+        <w:t xml:space="preserve">        [Product Catalog]</w:t>
+      </w:r>
+    </w:p>
+    <w:p>
+      <w:r>
+        <w:t xml:space="preserve">        [Inventory]</w:t>
+      </w:r>
+    </w:p>
+    <w:p>
+      <w:r>
+        <w:t xml:space="preserve">        [Shop/Base Mgmt]</w:t>
+      </w:r>
+    </w:p>
+    <w:p>
+      <w:r>
+        <w:t xml:space="preserve">        [Frameworks]</w:t>
+      </w:r>
+    </w:p>
+    <w:p>
+      <w:r>
+        <w:t xml:space="preserve">    }</w:t>
+      </w:r>
+    </w:p>
+    <w:p>
+      <w:r>
+        <w:t xml:space="preserve">    </w:t>
+      </w:r>
+    </w:p>
+    <w:p>
+      <w:r>
+        <w:t xml:space="preserve">    component "Client &amp; Config Service" as ClientSvc &lt;&lt;microservice&gt;&gt; {</w:t>
+      </w:r>
+    </w:p>
+    <w:p>
+      <w:r>
+        <w:t xml:space="preserve">        [Client Mgmt]</w:t>
+      </w:r>
+    </w:p>
+    <w:p>
+      <w:r>
+        <w:t xml:space="preserve">        [Config Settings]</w:t>
+      </w:r>
+    </w:p>
+    <w:p>
+      <w:r>
+        <w:t xml:space="preserve">        [Legal Agreements]</w:t>
+      </w:r>
+    </w:p>
+    <w:p>
+      <w:r>
+        <w:t xml:space="preserve">        [Approval Workflows]</w:t>
+      </w:r>
+    </w:p>
+    <w:p>
+      <w:r>
+        <w:t xml:space="preserve">        [Audit Logging Facade]</w:t>
+      </w:r>
+    </w:p>
+    <w:p>
+      <w:r>
+        <w:t xml:space="preserve">    }</w:t>
+      </w:r>
+    </w:p>
+    <w:p>
+      <w:r>
+        <w:t>}</w:t>
+      </w:r>
+    </w:p>
+    <w:p/>
+    <w:p>
+      <w:r>
+        <w:t>' ============================</w:t>
+      </w:r>
+    </w:p>
+    <w:p>
+      <w:r>
+        <w:t>' Financial Services</w:t>
+      </w:r>
+    </w:p>
+    <w:p>
+      <w:r>
+        <w:t>' ============================</w:t>
+      </w:r>
+    </w:p>
+    <w:p>
+      <w:r>
+        <w:t>package "Financial Services" {</w:t>
+      </w:r>
+    </w:p>
+    <w:p>
+      <w:r>
+        <w:t xml:space="preserve">    </w:t>
+      </w:r>
+    </w:p>
+    <w:p>
+      <w:r>
+        <w:t xml:space="preserve">    component "Financial Reporting\n&amp; Profit Service" as FinanceSvc &lt;&lt;microservice&gt;&gt; {</w:t>
+      </w:r>
+    </w:p>
+    <w:p>
+      <w:r>
+        <w:t xml:space="preserve">        [Profit Calculation]</w:t>
+      </w:r>
+    </w:p>
+    <w:p>
+      <w:r>
+        <w:t xml:space="preserve">        [App Treasure]</w:t>
+      </w:r>
+    </w:p>
+    <w:p>
+      <w:r>
+        <w:t xml:space="preserve">        [Financial Reports]</w:t>
+      </w:r>
+    </w:p>
+    <w:p>
+      <w:r>
+        <w:lastRenderedPageBreak/>
+        <w:t xml:space="preserve">        [Loss Tracking]</w:t>
+      </w:r>
+    </w:p>
+    <w:p>
+      <w:r>
+        <w:t xml:space="preserve">    }</w:t>
+      </w:r>
+    </w:p>
+    <w:p>
+      <w:r>
+        <w:t xml:space="preserve">    </w:t>
+      </w:r>
+    </w:p>
+    <w:p>
+      <w:r>
+        <w:t xml:space="preserve">    component "Payment Gateway Service" as PaymentSvc &lt;&lt;microservice&gt;&gt; {</w:t>
+      </w:r>
+    </w:p>
+    <w:p>
+      <w:r>
+        <w:t xml:space="preserve">        [Payment Processing]</w:t>
+      </w:r>
+    </w:p>
+    <w:p>
+      <w:r>
+        <w:t xml:space="preserve">        [Payouts]</w:t>
+      </w:r>
+    </w:p>
+    <w:p>
+      <w:r>
+        <w:t xml:space="preserve">        [Tokenization]</w:t>
+      </w:r>
+    </w:p>
+    <w:p>
+      <w:r>
+        <w:t xml:space="preserve">    }</w:t>
+      </w:r>
+    </w:p>
+    <w:p>
+      <w:r>
+        <w:t xml:space="preserve">    </w:t>
+      </w:r>
+    </w:p>
+    <w:p>
+      <w:r>
+        <w:t xml:space="preserve">    component "Discount Engine Service" as DiscountSvc &lt;&lt;microservice&gt;&gt; {</w:t>
+      </w:r>
+    </w:p>
+    <w:p>
+      <w:r>
+        <w:t xml:space="preserve">        [Discount Events]</w:t>
+      </w:r>
+    </w:p>
+    <w:p>
+      <w:r>
+        <w:t xml:space="preserve">        [Budget Allocation]</w:t>
+      </w:r>
+    </w:p>
+    <w:p>
+      <w:r>
+        <w:t xml:space="preserve">        [Customer Eligibility]</w:t>
+      </w:r>
+    </w:p>
+    <w:p>
+      <w:r>
+        <w:t xml:space="preserve">    }</w:t>
+      </w:r>
+    </w:p>
+    <w:p>
+      <w:r>
+        <w:t>}</w:t>
+      </w:r>
+    </w:p>
+    <w:p/>
+    <w:p>
+      <w:r>
+        <w:t>' ============================</w:t>
+      </w:r>
+    </w:p>
+    <w:p>
+      <w:r>
+        <w:t>' Support Services</w:t>
+      </w:r>
+    </w:p>
+    <w:p>
+      <w:r>
+        <w:t>' ============================</w:t>
+      </w:r>
+    </w:p>
+    <w:p>
+      <w:r>
+        <w:t>package "Support Services" {</w:t>
+      </w:r>
+    </w:p>
+    <w:p>
+      <w:r>
+        <w:t xml:space="preserve">    </w:t>
+      </w:r>
+    </w:p>
+    <w:p>
+      <w:r>
+        <w:t xml:space="preserve">    component "Notification Service" as NotifySvc &lt;&lt;microservice&gt;&gt; {</w:t>
+      </w:r>
+    </w:p>
+    <w:p>
+      <w:r>
+        <w:t xml:space="preserve">        [Email]</w:t>
+      </w:r>
+    </w:p>
+    <w:p>
+      <w:r>
+        <w:t xml:space="preserve">        [Push Notifications]</w:t>
+      </w:r>
+    </w:p>
+    <w:p>
+      <w:r>
+        <w:t xml:space="preserve">        [SMS OTP]</w:t>
+      </w:r>
+    </w:p>
+    <w:p>
+      <w:r>
+        <w:t xml:space="preserve">    }</w:t>
+      </w:r>
+    </w:p>
+    <w:p>
+      <w:r>
+        <w:t xml:space="preserve">    </w:t>
+      </w:r>
+    </w:p>
+    <w:p>
+      <w:r>
+        <w:t xml:space="preserve">    component "Complaint &amp; Return Service" as ComplaintSvc &lt;&lt;microservice&gt;&gt; {</w:t>
+      </w:r>
+    </w:p>
+    <w:p>
+      <w:r>
+        <w:t xml:space="preserve">        [Complaint Mgmt]</w:t>
+      </w:r>
+    </w:p>
+    <w:p>
+      <w:r>
+        <w:lastRenderedPageBreak/>
+        <w:t xml:space="preserve">        [Return Workflow]</w:t>
+      </w:r>
+    </w:p>
+    <w:p>
+      <w:r>
+        <w:t xml:space="preserve">        [Resolution]</w:t>
+      </w:r>
+    </w:p>
+    <w:p>
+      <w:r>
+        <w:t xml:space="preserve">    }</w:t>
+      </w:r>
+    </w:p>
+    <w:p>
+      <w:r>
+        <w:t xml:space="preserve">    </w:t>
+      </w:r>
+    </w:p>
+    <w:p>
+      <w:r>
+        <w:t xml:space="preserve">    component "Receipt Generator" as ReceiptGen &lt;&lt;microservice&gt;&gt; {</w:t>
+      </w:r>
+    </w:p>
+    <w:p>
+      <w:r>
+        <w:t xml:space="preserve">        [Receipt Image]</w:t>
+      </w:r>
+    </w:p>
+    <w:p>
+      <w:r>
+        <w:t xml:space="preserve">        [Barcode Signing]</w:t>
+      </w:r>
+    </w:p>
+    <w:p>
+      <w:r>
+        <w:t xml:space="preserve">    }</w:t>
+      </w:r>
+    </w:p>
+    <w:p>
+      <w:r>
+        <w:t>}</w:t>
+      </w:r>
+    </w:p>
+    <w:p/>
+    <w:p>
+      <w:r>
+        <w:t>' ============================</w:t>
+      </w:r>
+    </w:p>
+    <w:p>
+      <w:r>
+        <w:t>' Data Layer</w:t>
+      </w:r>
+    </w:p>
+    <w:p>
+      <w:r>
+        <w:t>' ============================</w:t>
+      </w:r>
+    </w:p>
+    <w:p>
+      <w:r>
+        <w:t>package "Data Layer" {</w:t>
+      </w:r>
+    </w:p>
+    <w:p>
+      <w:r>
+        <w:t xml:space="preserve">    database "Customer DB" as CustomerDB &lt;&lt;database&gt;&gt;</w:t>
+      </w:r>
+    </w:p>
+    <w:p>
+      <w:r>
+        <w:t xml:space="preserve">    database "Rider DB" as RiderDB &lt;&lt;database&gt;&gt;</w:t>
+      </w:r>
+    </w:p>
+    <w:p>
+      <w:r>
+        <w:t xml:space="preserve">    database "Order DB" as OrderDB &lt;&lt;database&gt;&gt;</w:t>
+      </w:r>
+    </w:p>
+    <w:p>
+      <w:r>
+        <w:t xml:space="preserve">    database "Trip DB" as TripDB &lt;&lt;database&gt;&gt;</w:t>
+      </w:r>
+    </w:p>
+    <w:p>
+      <w:r>
+        <w:t xml:space="preserve">    database "Dispatch DB" as DispatchDB &lt;&lt;database&gt;&gt;</w:t>
+      </w:r>
+    </w:p>
+    <w:p>
+      <w:r>
+        <w:t xml:space="preserve">    database "Product DB" as ProductDB &lt;&lt;database&gt;&gt;</w:t>
+      </w:r>
+    </w:p>
+    <w:p>
+      <w:r>
+        <w:t xml:space="preserve">    database "Config DB" as ConfigDB &lt;&lt;database&gt;&gt;</w:t>
+      </w:r>
+    </w:p>
+    <w:p>
+      <w:r>
+        <w:t xml:space="preserve">    database "Finance DB" as FinanceDB &lt;&lt;database&gt;&gt;</w:t>
+      </w:r>
+    </w:p>
+    <w:p>
+      <w:r>
+        <w:t xml:space="preserve">    database "Payment DB" as PaymentDB &lt;&lt;database&gt;&gt;</w:t>
+      </w:r>
+    </w:p>
+    <w:p>
+      <w:r>
+        <w:t xml:space="preserve">    database "Complaint DB" as ComplaintDB &lt;&lt;database&gt;&gt;</w:t>
+      </w:r>
+    </w:p>
+    <w:p>
+      <w:r>
+        <w:t xml:space="preserve">    database "Audit Log DB" as AuditLogDB &lt;&lt;database&gt;&gt;</w:t>
+      </w:r>
+    </w:p>
+    <w:p>
+      <w:r>
+        <w:t xml:space="preserve">    </w:t>
+      </w:r>
+    </w:p>
+    <w:p>
+      <w:r>
+        <w:t xml:space="preserve">    database "Redis Cache\n(Live Locations)" as Redis &lt;&lt;cache&gt;&gt;</w:t>
+      </w:r>
+    </w:p>
+    <w:p>
+      <w:r>
+        <w:t xml:space="preserve">    database "Cloud Storage\n(Images/Docs)" as CloudStorage &lt;&lt;storage&gt;&gt;</w:t>
+      </w:r>
+    </w:p>
+    <w:p>
+      <w:r>
+        <w:t>}</w:t>
+      </w:r>
+    </w:p>
+    <w:p/>
+    <w:p>
+      <w:r>
+        <w:t>' ============================</w:t>
+      </w:r>
+    </w:p>
+    <w:p>
+      <w:r>
+        <w:t>' Messaging &amp; Scheduling</w:t>
+      </w:r>
+    </w:p>
+    <w:p>
+      <w:r>
+        <w:t>' ============================</w:t>
+      </w:r>
+    </w:p>
+    <w:p>
+      <w:r>
+        <w:t>package "Async Communication" {</w:t>
+      </w:r>
+    </w:p>
+    <w:p>
+      <w:r>
+        <w:t xml:space="preserve">    queue "Message Broker\n(Kafka / RabbitMQ)" as EventBus &lt;&lt;middleware&gt;&gt;</w:t>
+      </w:r>
+    </w:p>
+    <w:p>
+      <w:r>
+        <w:t xml:space="preserve">    component "Scheduled Jobs\n(Quartz)" as Scheduler &lt;&lt;scheduler&gt;&gt;</w:t>
+      </w:r>
+    </w:p>
+    <w:p>
+      <w:r>
+        <w:t>}</w:t>
+      </w:r>
+    </w:p>
+    <w:p/>
+    <w:p>
+      <w:r>
+        <w:t>' ============================</w:t>
+      </w:r>
+    </w:p>
+    <w:p>
+      <w:r>
+        <w:t>' External Systems</w:t>
+      </w:r>
+    </w:p>
+    <w:p>
+      <w:r>
+        <w:t>' ============================</w:t>
+      </w:r>
+    </w:p>
+    <w:p>
+      <w:r>
+        <w:t>package "External Systems" {</w:t>
+      </w:r>
+    </w:p>
+    <w:p>
+      <w:r>
+        <w:t xml:space="preserve">    component "Google Maps API" as GoogleMaps &lt;&lt;external&gt;&gt;</w:t>
+      </w:r>
+    </w:p>
+    <w:p>
+      <w:r>
+        <w:t xml:space="preserve">    component "Payment Gateway\n(Stripe/Easypaisa/Jazzcash)" as ExtPayment &lt;&lt;external&gt;&gt;</w:t>
+      </w:r>
+    </w:p>
+    <w:p>
+      <w:r>
+        <w:t xml:space="preserve">    component "SMS/Email Providers\n(Twilio/SendGrid)" as ExtNotify &lt;&lt;external&gt;&gt;</w:t>
+      </w:r>
+    </w:p>
+    <w:p>
+      <w:r>
+        <w:t>}</w:t>
+      </w:r>
+    </w:p>
+    <w:p/>
+    <w:p>
+      <w:r>
+        <w:t>' ============================</w:t>
+      </w:r>
+    </w:p>
+    <w:p>
+      <w:r>
+        <w:t>' Connections: Clients to Gateway</w:t>
+      </w:r>
+    </w:p>
+    <w:p>
+      <w:r>
+        <w:t>' ============================</w:t>
+      </w:r>
+    </w:p>
+    <w:p>
+      <w:r>
+        <w:t>Cust --&gt; Gateway : HTTPS/WSS</w:t>
+      </w:r>
+    </w:p>
+    <w:p>
+      <w:r>
+        <w:t>Rider --&gt; Gateway : HTTPS/WSS</w:t>
+      </w:r>
+    </w:p>
+    <w:p>
+      <w:r>
+        <w:t>Client --&gt; Gateway : HTTPS/WSS</w:t>
+      </w:r>
+    </w:p>
+    <w:p/>
+    <w:p>
+      <w:r>
+        <w:t>' ============================</w:t>
+      </w:r>
+    </w:p>
+    <w:p>
+      <w:r>
+        <w:t>' Gateway to Services (REST / WebSocket)</w:t>
+      </w:r>
+    </w:p>
+    <w:p>
+      <w:r>
+        <w:t>' ============================</w:t>
+      </w:r>
+    </w:p>
+    <w:p>
+      <w:r>
+        <w:t>Gateway --&gt; CustomerSvc : REST</w:t>
+      </w:r>
+    </w:p>
+    <w:p>
+      <w:r>
+        <w:lastRenderedPageBreak/>
+        <w:t>Gateway --&gt; RiderSvc : REST</w:t>
+      </w:r>
+    </w:p>
+    <w:p>
+      <w:r>
+        <w:t>Gateway --&gt; OrderSvc : REST</w:t>
+      </w:r>
+    </w:p>
+    <w:p>
+      <w:r>
+        <w:t>Gateway --&gt; TripSvc : REST, WebSocket</w:t>
+      </w:r>
+    </w:p>
+    <w:p>
+      <w:r>
+        <w:t>Gateway --&gt; DispatchSvc : REST, WebSocket</w:t>
+      </w:r>
+    </w:p>
+    <w:p>
+      <w:r>
+        <w:t>Gateway --&gt; ProductSvc : REST</w:t>
+      </w:r>
+    </w:p>
+    <w:p>
+      <w:r>
+        <w:t>Gateway --&gt; ClientSvc : REST</w:t>
+      </w:r>
+    </w:p>
+    <w:p>
+      <w:r>
+        <w:t>Gateway --&gt; FinanceSvc : REST</w:t>
+      </w:r>
+    </w:p>
+    <w:p>
+      <w:r>
+        <w:t>Gateway --&gt; PaymentSvc : REST</w:t>
+      </w:r>
+    </w:p>
+    <w:p>
+      <w:r>
+        <w:t>Gateway --&gt; DiscountSvc : REST</w:t>
+      </w:r>
+    </w:p>
+    <w:p>
+      <w:r>
+        <w:t>Gateway --&gt; ComplaintSvc : REST</w:t>
+      </w:r>
+    </w:p>
+    <w:p>
+      <w:r>
+        <w:t>Gateway --&gt; NotifySvc : REST</w:t>
+      </w:r>
+    </w:p>
+    <w:p/>
+    <w:p>
+      <w:r>
+        <w:t>' ============================</w:t>
+      </w:r>
+    </w:p>
+    <w:p>
+      <w:r>
+        <w:t>' Synchronous Inter-Service Communication (REST)</w:t>
+      </w:r>
+    </w:p>
+    <w:p>
+      <w:r>
+        <w:t>' ============================</w:t>
+      </w:r>
+    </w:p>
+    <w:p>
+      <w:r>
+        <w:t>CustomerSvc --&gt; NotifySvc : REST</w:t>
+      </w:r>
+    </w:p>
+    <w:p>
+      <w:r>
+        <w:t>CustomerSvc --&gt; PaymentSvc : REST</w:t>
+      </w:r>
+    </w:p>
+    <w:p>
+      <w:r>
+        <w:t>CustomerSvc --&gt; ProductSvc : REST</w:t>
+      </w:r>
+    </w:p>
+    <w:p/>
+    <w:p>
+      <w:r>
+        <w:t>RiderSvc --&gt; NotifySvc : REST</w:t>
+      </w:r>
+    </w:p>
+    <w:p>
+      <w:r>
+        <w:t>RiderSvc --&gt; FinanceSvc : REST</w:t>
+      </w:r>
+    </w:p>
+    <w:p/>
+    <w:p>
+      <w:r>
+        <w:t>OrderSvc --&gt; ProductSvc : REST</w:t>
+      </w:r>
+    </w:p>
+    <w:p>
+      <w:r>
+        <w:t>OrderSvc --&gt; DiscountSvc : REST</w:t>
+      </w:r>
+    </w:p>
+    <w:p>
+      <w:r>
+        <w:t>OrderSvc --&gt; ReceiptGen : REST</w:t>
+      </w:r>
+    </w:p>
+    <w:p>
+      <w:r>
+        <w:t>OrderSvc --&gt; CustomerSvc : REST</w:t>
+      </w:r>
+    </w:p>
+    <w:p/>
+    <w:p>
+      <w:r>
+        <w:t>TripSvc --&gt; RiderSvc : REST</w:t>
+      </w:r>
+    </w:p>
+    <w:p>
+      <w:r>
+        <w:t>TripSvc --&gt; OrderSvc : REST</w:t>
+      </w:r>
+    </w:p>
+    <w:p>
+      <w:r>
+        <w:lastRenderedPageBreak/>
+        <w:t>TripSvc --&gt; ClientSvc : REST</w:t>
+      </w:r>
+    </w:p>
+    <w:p>
+      <w:r>
+        <w:t>TripSvc --&gt; FinanceSvc : REST</w:t>
+      </w:r>
+    </w:p>
+    <w:p>
+      <w:r>
+        <w:t>TripSvc --&gt; DispatchSvc : REST</w:t>
+      </w:r>
+    </w:p>
+    <w:p>
+      <w:r>
+        <w:t>TripSvc --&gt; ProductSvc : REST</w:t>
+      </w:r>
+    </w:p>
+    <w:p/>
+    <w:p>
+      <w:r>
+        <w:t>DispatchSvc --&gt; RiderSvc : REST</w:t>
+      </w:r>
+    </w:p>
+    <w:p>
+      <w:r>
+        <w:t>DispatchSvc --&gt; OrderSvc : REST</w:t>
+      </w:r>
+    </w:p>
+    <w:p>
+      <w:r>
+        <w:t>DispatchSvc --&gt; TripSvc : REST</w:t>
+      </w:r>
+    </w:p>
+    <w:p>
+      <w:r>
+        <w:t>DispatchSvc --&gt; ClientSvc : REST</w:t>
+      </w:r>
+    </w:p>
+    <w:p/>
+    <w:p>
+      <w:r>
+        <w:t>ProductSvc --&gt; GoogleMaps : HTTPS</w:t>
+      </w:r>
+    </w:p>
+    <w:p/>
+    <w:p>
+      <w:r>
+        <w:t>FinanceSvc --&gt; PaymentSvc : REST</w:t>
+      </w:r>
+    </w:p>
+    <w:p>
+      <w:r>
+        <w:t>FinanceSvc --&gt; OrderSvc : REST</w:t>
+      </w:r>
+    </w:p>
+    <w:p>
+      <w:r>
+        <w:t>FinanceSvc --&gt; TripSvc : REST</w:t>
+      </w:r>
+    </w:p>
+    <w:p>
+      <w:r>
+        <w:t>FinanceSvc --&gt; RiderSvc : REST</w:t>
+      </w:r>
+    </w:p>
+    <w:p>
+      <w:r>
+        <w:t>FinanceSvc --&gt; ProductSvc : REST</w:t>
+      </w:r>
+    </w:p>
+    <w:p/>
+    <w:p>
+      <w:r>
+        <w:t>ComplaintSvc --&gt; OrderSvc : REST</w:t>
+      </w:r>
+    </w:p>
+    <w:p>
+      <w:r>
+        <w:t>ComplaintSvc --&gt; CustomerSvc : REST</w:t>
+      </w:r>
+    </w:p>
+    <w:p>
+      <w:r>
+        <w:t>ComplaintSvc --&gt; TripSvc : REST</w:t>
+      </w:r>
+    </w:p>
+    <w:p>
+      <w:r>
+        <w:t>ComplaintSvc --&gt; NotifySvc : REST</w:t>
+      </w:r>
+    </w:p>
+    <w:p>
+      <w:r>
+        <w:t>ComplaintSvc --&gt; ProductSvc : REST</w:t>
+      </w:r>
+    </w:p>
+    <w:p>
+      <w:r>
+        <w:t>ComplaintSvc --&gt; RiderSvc : REST</w:t>
+      </w:r>
+    </w:p>
+    <w:p>
+      <w:r>
+        <w:t>ComplaintSvc --&gt; PaymentSvc : REST</w:t>
+      </w:r>
+    </w:p>
+    <w:p/>
+    <w:p>
+      <w:r>
+        <w:t>ClientSvc --&gt; NotifySvc : REST</w:t>
+      </w:r>
+    </w:p>
+    <w:p>
+      <w:r>
+        <w:t>ClientSvc --&gt; RiderSvc : REST</w:t>
+      </w:r>
+    </w:p>
+    <w:p>
+      <w:r>
+        <w:t>ClientSvc --&gt; FinanceSvc : REST</w:t>
+      </w:r>
+    </w:p>
+    <w:p/>
+    <w:p>
+      <w:r>
+        <w:t>DiscountSvc --&gt; FinanceSvc : REST</w:t>
+      </w:r>
+    </w:p>
+    <w:p>
+      <w:r>
+        <w:t>DiscountSvc --&gt; CustomerSvc : REST</w:t>
+      </w:r>
+    </w:p>
+    <w:p/>
+    <w:p>
+      <w:r>
+        <w:t>ReceiptGen --&gt; OrderSvc : REST</w:t>
+      </w:r>
+    </w:p>
+    <w:p/>
+    <w:p>
+      <w:r>
+        <w:t>PaymentSvc --&gt; ExtPayment : HTTPS</w:t>
+      </w:r>
+    </w:p>
+    <w:p/>
+    <w:p>
+      <w:r>
+        <w:t>NotifySvc --&gt; ExtNotify : HTTPS</w:t>
+      </w:r>
+    </w:p>
+    <w:p/>
+    <w:p>
+      <w:r>
+        <w:t>Scheduler --&gt; DiscountSvc : REST</w:t>
+      </w:r>
+    </w:p>
+    <w:p/>
+    <w:p>
+      <w:r>
+        <w:t>' ============================</w:t>
+      </w:r>
+    </w:p>
+    <w:p>
+      <w:r>
+        <w:t>' Asynchronous Communication (Event Bus)</w:t>
+      </w:r>
+    </w:p>
+    <w:p>
+      <w:r>
+        <w:t>' ============================</w:t>
+      </w:r>
+    </w:p>
+    <w:p>
+      <w:r>
+        <w:t>OrderSvc --&gt; EventBus : publish (OrderPlaced, OrderStatusChanged)</w:t>
+      </w:r>
+    </w:p>
+    <w:p>
+      <w:r>
+        <w:t>TripSvc --&gt; EventBus : publish (TripStarted, OrderProcessed, DeviationDetected)</w:t>
+      </w:r>
+    </w:p>
+    <w:p>
+      <w:r>
+        <w:t>DispatchSvc --&gt; EventBus : consume (OrderPlaced) / publish (OrderAssigned)</w:t>
+      </w:r>
+    </w:p>
+    <w:p>
+      <w:r>
+        <w:t>PaymentSvc --&gt; EventBus : publish (PaymentCompleted)</w:t>
+      </w:r>
+    </w:p>
+    <w:p>
+      <w:r>
+        <w:t>CustomerSvc --&gt; EventBus : publish (CustomerCreated)</w:t>
+      </w:r>
+    </w:p>
+    <w:p>
+      <w:r>
+        <w:t>RiderSvc --&gt; EventBus : publish (RiderApproved)</w:t>
+      </w:r>
+    </w:p>
+    <w:p>
+      <w:r>
+        <w:t>NotifySvc --&gt; EventBus : consume (multiple events)</w:t>
+      </w:r>
+    </w:p>
+    <w:p/>
+    <w:p>
+      <w:r>
+        <w:t>' ============================</w:t>
+      </w:r>
+    </w:p>
+    <w:p>
+      <w:r>
+        <w:t>' Database Connections</w:t>
+      </w:r>
+    </w:p>
+    <w:p>
+      <w:r>
+        <w:t>' ============================</w:t>
+      </w:r>
+    </w:p>
+    <w:p>
+      <w:r>
+        <w:t>CustomerSvc --&gt; CustomerDB : JDBC</w:t>
+      </w:r>
+    </w:p>
+    <w:p>
+      <w:r>
+        <w:t>RiderSvc --&gt; RiderDB : JDBC</w:t>
+      </w:r>
+    </w:p>
+    <w:p>
+      <w:r>
+        <w:t>OrderSvc --&gt; OrderDB : JDBC</w:t>
+      </w:r>
+    </w:p>
+    <w:p>
+      <w:r>
+        <w:lastRenderedPageBreak/>
+        <w:t>TripSvc --&gt; TripDB : JDBC</w:t>
+      </w:r>
+    </w:p>
+    <w:p>
+      <w:r>
+        <w:t>DispatchSvc --&gt; DispatchDB : JDBC</w:t>
+      </w:r>
+    </w:p>
+    <w:p>
+      <w:r>
+        <w:t>ProductSvc --&gt; ProductDB : JDBC</w:t>
+      </w:r>
+    </w:p>
+    <w:p>
+      <w:r>
+        <w:t>ClientSvc --&gt; ConfigDB : JDBC</w:t>
+      </w:r>
+    </w:p>
+    <w:p>
+      <w:r>
+        <w:t>FinanceSvc --&gt; FinanceDB : JDBC</w:t>
+      </w:r>
+    </w:p>
+    <w:p>
+      <w:r>
+        <w:t>PaymentSvc --&gt; PaymentDB : JDBC</w:t>
+      </w:r>
+    </w:p>
+    <w:p>
+      <w:r>
+        <w:t>ComplaintSvc --&gt; ComplaintDB : JDBC</w:t>
+      </w:r>
+    </w:p>
+    <w:p/>
+    <w:p>
+      <w:r>
+        <w:t>' Audit logging (all services call ClientSvc.logAction())</w:t>
+      </w:r>
+    </w:p>
+    <w:p>
+      <w:r>
+        <w:t>CustomerSvc --&gt; ClientSvc : REST (logAction)</w:t>
+      </w:r>
+    </w:p>
+    <w:p>
+      <w:r>
+        <w:t>RiderSvc --&gt; ClientSvc : REST (logAction)</w:t>
+      </w:r>
+    </w:p>
+    <w:p>
+      <w:r>
+        <w:t>OrderSvc --&gt; ClientSvc : REST (logAction)</w:t>
+      </w:r>
+    </w:p>
+    <w:p>
+      <w:r>
+        <w:t>TripSvc --&gt; ClientSvc : REST (logAction)</w:t>
+      </w:r>
+    </w:p>
+    <w:p>
+      <w:r>
+        <w:t>DispatchSvc --&gt; ClientSvc : REST (logAction)</w:t>
+      </w:r>
+    </w:p>
+    <w:p>
+      <w:r>
+        <w:t>ProductSvc --&gt; ClientSvc : REST (logAction)</w:t>
+      </w:r>
+    </w:p>
+    <w:p>
+      <w:r>
+        <w:t>FinanceSvc --&gt; ClientSvc : REST (logAction)</w:t>
+      </w:r>
+    </w:p>
+    <w:p>
+      <w:r>
+        <w:t>PaymentSvc --&gt; ClientSvc : REST (logAction)</w:t>
+      </w:r>
+    </w:p>
+    <w:p>
+      <w:r>
+        <w:t>DiscountSvc --&gt; ClientSvc : REST (logAction)</w:t>
+      </w:r>
+    </w:p>
+    <w:p>
+      <w:r>
+        <w:t>ComplaintSvc --&gt; ClientSvc : REST (logAction)</w:t>
+      </w:r>
+    </w:p>
+    <w:p/>
+    <w:p>
+      <w:r>
+        <w:t>ClientSvc --&gt; AuditLogDB : JDBC (immutable writes)</w:t>
+      </w:r>
+    </w:p>
+    <w:p/>
+    <w:p>
+      <w:r>
+        <w:t>' Redis connections</w:t>
+      </w:r>
+    </w:p>
+    <w:p>
+      <w:r>
+        <w:t>TripSvc --&gt; Redis : TCP (live locations)</w:t>
+      </w:r>
+    </w:p>
+    <w:p>
+      <w:r>
+        <w:t>Gateway --&gt; Redis : TCP (session store)</w:t>
+      </w:r>
+    </w:p>
+    <w:p/>
+    <w:p>
+      <w:r>
+        <w:t>' Cloud Storage connections</w:t>
+      </w:r>
+    </w:p>
+    <w:p>
+      <w:r>
+        <w:t>RiderSvc --&gt; CloudStorage : HTTPS (images/docs)</w:t>
+      </w:r>
+    </w:p>
+    <w:p>
+      <w:r>
+        <w:t>ProductSvc --&gt; CloudStorage : HTTPS (product images)</w:t>
+      </w:r>
+    </w:p>
+    <w:p>
+      <w:r>
+        <w:lastRenderedPageBreak/>
+        <w:t>ComplaintSvc --&gt; CloudStorage : HTTPS (evidence)</w:t>
+      </w:r>
+    </w:p>
+    <w:p>
+      <w:r>
+        <w:t>ClientSvc --&gt; CloudStorage : HTTPS (legal agreements)</w:t>
+      </w:r>
+    </w:p>
+    <w:p/>
+    <w:p>
+      <w:r>
+        <w:t>' ============================</w:t>
+      </w:r>
+    </w:p>
+    <w:p>
+      <w:r>
+        <w:t>' Notes</w:t>
+      </w:r>
+    </w:p>
+    <w:p>
+      <w:r>
+        <w:t>' ============================</w:t>
+      </w:r>
+    </w:p>
+    <w:p>
+      <w:r>
+        <w:t>note top of Gateway</w:t>
+      </w:r>
+    </w:p>
+    <w:p>
+      <w:r>
+        <w:t xml:space="preserve">  Single entry point for all clients.</w:t>
+      </w:r>
+    </w:p>
+    <w:p>
+      <w:r>
+        <w:t xml:space="preserve">  Routes requests to appropriate microservices.</w:t>
+      </w:r>
+    </w:p>
+    <w:p>
+      <w:r>
+        <w:t xml:space="preserve">  Handles cross-cutting concerns.</w:t>
+      </w:r>
+    </w:p>
+    <w:p>
+      <w:r>
+        <w:t>end note</w:t>
+      </w:r>
+    </w:p>
+    <w:p/>
+    <w:p>
+      <w:r>
+        <w:t>note bottom of EventBus</w:t>
+      </w:r>
+    </w:p>
+    <w:p>
+      <w:r>
+        <w:t xml:space="preserve">  Enables asynchronous, event-driven communication.</w:t>
+      </w:r>
+    </w:p>
+    <w:p>
+      <w:r>
+        <w:t xml:space="preserve">  Decouples services and ensures eventual consistency.</w:t>
+      </w:r>
+    </w:p>
+    <w:p>
+      <w:r>
+        <w:t xml:space="preserve">  Supports Saga pattern for distributed transactions.</w:t>
+      </w:r>
+    </w:p>
+    <w:p>
+      <w:r>
+        <w:t>end note</w:t>
+      </w:r>
+    </w:p>
+    <w:p/>
+    <w:p>
+      <w:r>
+        <w:t>note right of ClientSvc</w:t>
+      </w:r>
+    </w:p>
+    <w:p>
+      <w:r>
+        <w:t xml:space="preserve">  Acts as audit logging facade.</w:t>
+      </w:r>
+    </w:p>
+    <w:p>
+      <w:r>
+        <w:t xml:space="preserve">  All other services log actions via ClientSvc.logAction().</w:t>
+      </w:r>
+    </w:p>
+    <w:p>
+      <w:r>
+        <w:t xml:space="preserve">  Writes immutable records to AuditLogDB.</w:t>
       </w:r>
     </w:p>
     <w:p>

</xml_diff>

<commit_message>
created security architecture diagram
</commit_message>
<xml_diff>
--- a/SDS Document Code.docx
+++ b/SDS Document Code.docx
@@ -38327,6 +38327,911 @@
     <w:p>
       <w:r>
         <w:t>end note</w:t>
+      </w:r>
+    </w:p>
+    <w:p/>
+    <w:p>
+      <w:r>
+        <w:t>@enduml</w:t>
+      </w:r>
+    </w:p>
+    <w:p>
+      <w:pPr>
+        <w:pStyle w:val="Heading1"/>
+      </w:pPr>
+      <w:r>
+        <w:t>Security Architecture Diagram</w:t>
+      </w:r>
+    </w:p>
+    <w:p>
+      <w:r>
+        <w:t>@startuml</w:t>
+      </w:r>
+    </w:p>
+    <w:p>
+      <w:r>
+        <w:t>!theme plain</w:t>
+      </w:r>
+    </w:p>
+    <w:p>
+      <w:r>
+        <w:t>title Security Architecture Diagram – Delivery Platform System (v4.0 – Verified)</w:t>
+      </w:r>
+    </w:p>
+    <w:p/>
+    <w:p>
+      <w:r>
+        <w:t>' ============================</w:t>
+      </w:r>
+    </w:p>
+    <w:p>
+      <w:r>
+        <w:t>' External Actors</w:t>
+      </w:r>
+    </w:p>
+    <w:p>
+      <w:r>
+        <w:t>' ============================</w:t>
+      </w:r>
+    </w:p>
+    <w:p>
+      <w:r>
+        <w:t>actor "Customer" as Cust &lt;&lt;Human&gt;&gt;</w:t>
+      </w:r>
+    </w:p>
+    <w:p>
+      <w:r>
+        <w:t>actor "Rider" as Rider &lt;&lt;Human&gt;&gt;</w:t>
+      </w:r>
+    </w:p>
+    <w:p>
+      <w:r>
+        <w:t>actor "Client" as Client &lt;&lt;Human&gt;&gt;</w:t>
+      </w:r>
+    </w:p>
+    <w:p>
+      <w:r>
+        <w:t>actor "Attacker / Malicious User" as Attacker &lt;&lt;threat&gt;&gt; #red</w:t>
+      </w:r>
+    </w:p>
+    <w:p/>
+    <w:p>
+      <w:r>
+        <w:t>' ============================</w:t>
+      </w:r>
+    </w:p>
+    <w:p>
+      <w:r>
+        <w:t>' Security Zones</w:t>
+      </w:r>
+    </w:p>
+    <w:p>
+      <w:r>
+        <w:t>' ============================</w:t>
+      </w:r>
+    </w:p>
+    <w:p>
+      <w:r>
+        <w:t>package "Public Internet (Untrusted)" &lt;&lt;zone&gt;&gt; {</w:t>
+      </w:r>
+    </w:p>
+    <w:p>
+      <w:r>
+        <w:t xml:space="preserve">    Cust --&gt; [HTTPS/WSS]</w:t>
+      </w:r>
+    </w:p>
+    <w:p>
+      <w:r>
+        <w:t xml:space="preserve">    Rider --&gt; [HTTPS/WSS]</w:t>
+      </w:r>
+    </w:p>
+    <w:p>
+      <w:r>
+        <w:t xml:space="preserve">    Client --&gt; [HTTPS/WSS]</w:t>
+      </w:r>
+    </w:p>
+    <w:p>
+      <w:r>
+        <w:t xml:space="preserve">    Attacker --&gt; [Attempts]</w:t>
+      </w:r>
+    </w:p>
+    <w:p>
+      <w:r>
+        <w:t>}</w:t>
+      </w:r>
+    </w:p>
+    <w:p/>
+    <w:p>
+      <w:r>
+        <w:t>package "DMZ / Perimeter" &lt;&lt;zone&gt;&gt; {</w:t>
+      </w:r>
+    </w:p>
+    <w:p>
+      <w:r>
+        <w:t xml:space="preserve">    component "Load Balancer\n(TLS Termination)" as LB &lt;&lt;security&gt;&gt;</w:t>
+      </w:r>
+    </w:p>
+    <w:p>
+      <w:r>
+        <w:t xml:space="preserve">    note right of LB</w:t>
+      </w:r>
+    </w:p>
+    <w:p>
+      <w:r>
+        <w:t xml:space="preserve">      - TLS 1.3 only (SEC-02)</w:t>
+      </w:r>
+    </w:p>
+    <w:p>
+      <w:r>
+        <w:t xml:space="preserve">      - DDoS Protection</w:t>
+      </w:r>
+    </w:p>
+    <w:p>
+      <w:r>
+        <w:t xml:space="preserve">      - Geo-IP Filtering (Pakistan, NFR-21)</w:t>
+      </w:r>
+    </w:p>
+    <w:p>
+      <w:r>
+        <w:t xml:space="preserve">    end note</w:t>
+      </w:r>
+    </w:p>
+    <w:p>
+      <w:r>
+        <w:t>}</w:t>
+      </w:r>
+    </w:p>
+    <w:p/>
+    <w:p>
+      <w:r>
+        <w:t>package "Kubernetes Cluster (Internal Network)" &lt;&lt;zone&gt;&gt; {</w:t>
+      </w:r>
+    </w:p>
+    <w:p>
+      <w:r>
+        <w:lastRenderedPageBreak/>
+        <w:t xml:space="preserve">    </w:t>
+      </w:r>
+    </w:p>
+    <w:p>
+      <w:r>
+        <w:t xml:space="preserve">    package "API Gateway" {</w:t>
+      </w:r>
+    </w:p>
+    <w:p>
+      <w:r>
+        <w:t xml:space="preserve">        component "Spring Cloud Gateway" as Gateway &lt;&lt;security gateway&gt;&gt;</w:t>
+      </w:r>
+    </w:p>
+    <w:p>
+      <w:r>
+        <w:t xml:space="preserve">        note bottom of Gateway</w:t>
+      </w:r>
+    </w:p>
+    <w:p>
+      <w:r>
+        <w:t xml:space="preserve">          - JWT Validation (SEC-09)</w:t>
+      </w:r>
+    </w:p>
+    <w:p>
+      <w:r>
+        <w:t xml:space="preserve">          - Rate Limiting (SEC-25): 100/min public, 10/min payment</w:t>
+      </w:r>
+    </w:p>
+    <w:p>
+      <w:r>
+        <w:t xml:space="preserve">          - API Key Validation for internal clients</w:t>
+      </w:r>
+    </w:p>
+    <w:p>
+      <w:r>
+        <w:t xml:space="preserve">          - CORS Policy</w:t>
+      </w:r>
+    </w:p>
+    <w:p>
+      <w:r>
+        <w:t xml:space="preserve">          - Request Validation / Sanitization</w:t>
+      </w:r>
+    </w:p>
+    <w:p>
+      <w:r>
+        <w:t xml:space="preserve">          - Suspicious Activity Alerts (SEC-26)</w:t>
+      </w:r>
+    </w:p>
+    <w:p>
+      <w:r>
+        <w:t xml:space="preserve">        end note</w:t>
+      </w:r>
+    </w:p>
+    <w:p>
+      <w:r>
+        <w:t xml:space="preserve">    }</w:t>
+      </w:r>
+    </w:p>
+    <w:p>
+      <w:r>
+        <w:t xml:space="preserve">    </w:t>
+      </w:r>
+    </w:p>
+    <w:p>
+      <w:r>
+        <w:t xml:space="preserve">    package "Microservices" {</w:t>
+      </w:r>
+    </w:p>
+    <w:p>
+      <w:r>
+        <w:t xml:space="preserve">        component "Customer Service" as CustSvc &lt;&lt;microservice&gt;&gt;</w:t>
+      </w:r>
+    </w:p>
+    <w:p>
+      <w:r>
+        <w:t xml:space="preserve">        component "Rider Service" as RiderSvc &lt;&lt;microservice&gt;&gt;</w:t>
+      </w:r>
+    </w:p>
+    <w:p>
+      <w:r>
+        <w:t xml:space="preserve">        component "Order Service" as OrderSvc &lt;&lt;microservice&gt;&gt;</w:t>
+      </w:r>
+    </w:p>
+    <w:p>
+      <w:r>
+        <w:t xml:space="preserve">        component "Trip Service" as TripSvc &lt;&lt;microservice&gt;&gt;</w:t>
+      </w:r>
+    </w:p>
+    <w:p>
+      <w:r>
+        <w:t xml:space="preserve">        component "Dispatch Service" as DispatchSvc &lt;&lt;microservice&gt;&gt;</w:t>
+      </w:r>
+    </w:p>
+    <w:p>
+      <w:r>
+        <w:t xml:space="preserve">        component "Product Service" as ProdSvc &lt;&lt;microservice&gt;&gt;</w:t>
+      </w:r>
+    </w:p>
+    <w:p>
+      <w:r>
+        <w:t xml:space="preserve">        component "Client Service" as ClientSvc &lt;&lt;microservice&gt;&gt;</w:t>
+      </w:r>
+    </w:p>
+    <w:p>
+      <w:r>
+        <w:t xml:space="preserve">        component "Finance Service" as FinSvc &lt;&lt;microservice&gt;&gt;</w:t>
+      </w:r>
+    </w:p>
+    <w:p>
+      <w:r>
+        <w:t xml:space="preserve">        component "Payment Service" as PaySvc &lt;&lt;microservice&gt;&gt;</w:t>
+      </w:r>
+    </w:p>
+    <w:p>
+      <w:r>
+        <w:t xml:space="preserve">        component "Discount Service" as DiscSvc &lt;&lt;microservice&gt;&gt;</w:t>
+      </w:r>
+    </w:p>
+    <w:p>
+      <w:r>
+        <w:t xml:space="preserve">        component "Notification Service" as NotifySvc &lt;&lt;microservice&gt;&gt;</w:t>
+      </w:r>
+    </w:p>
+    <w:p>
+      <w:r>
+        <w:t xml:space="preserve">        component "Complaint Service" as CompSvc &lt;&lt;microservice&gt;&gt;</w:t>
+      </w:r>
+    </w:p>
+    <w:p>
+      <w:r>
+        <w:t xml:space="preserve">        </w:t>
+      </w:r>
+    </w:p>
+    <w:p>
+      <w:r>
+        <w:t xml:space="preserve">        note top of Microservices</w:t>
+      </w:r>
+    </w:p>
+    <w:p>
+      <w:r>
+        <w:t xml:space="preserve">          - Method-level authorization (@PreAuthorize)</w:t>
+      </w:r>
+    </w:p>
+    <w:p>
+      <w:r>
+        <w:lastRenderedPageBreak/>
+        <w:t xml:space="preserve">          - Input validation &amp; output encoding</w:t>
+      </w:r>
+    </w:p>
+    <w:p>
+      <w:r>
+        <w:t xml:space="preserve">          - Circuit breakers (Resilience4j)</w:t>
+      </w:r>
+    </w:p>
+    <w:p>
+      <w:r>
+        <w:t xml:space="preserve">          - Inter-service calls secured by Kubernetes Network Policies + mTLS</w:t>
+      </w:r>
+    </w:p>
+    <w:p>
+      <w:r>
+        <w:t xml:space="preserve">          - Rider cash limit enforced server-side (SEC-20)</w:t>
+      </w:r>
+    </w:p>
+    <w:p>
+      <w:r>
+        <w:t xml:space="preserve">        end note</w:t>
+      </w:r>
+    </w:p>
+    <w:p>
+      <w:r>
+        <w:t xml:space="preserve">    }</w:t>
+      </w:r>
+    </w:p>
+    <w:p>
+      <w:r>
+        <w:t xml:space="preserve">    </w:t>
+      </w:r>
+    </w:p>
+    <w:p>
+      <w:r>
+        <w:t xml:space="preserve">    package "Data Layer" {</w:t>
+      </w:r>
+    </w:p>
+    <w:p>
+      <w:r>
+        <w:t xml:space="preserve">        database "PostgreSQL\n(Encrypted at Rest)" as Postgres &lt;&lt;database&gt;&gt;</w:t>
+      </w:r>
+    </w:p>
+    <w:p>
+      <w:r>
+        <w:t xml:space="preserve">        database "Redis\n(Session / Location)" as Redis &lt;&lt;cache&gt;&gt;</w:t>
+      </w:r>
+    </w:p>
+    <w:p>
+      <w:r>
+        <w:t xml:space="preserve">        database "Audit Log DB\n(Immutable, 1yr retention)" as AuditDB &lt;&lt;database&gt;&gt;</w:t>
+      </w:r>
+    </w:p>
+    <w:p>
+      <w:r>
+        <w:t xml:space="preserve">        database "Cloud Storage\n(S3 / Spaces)" as Storage &lt;&lt;storage&gt;&gt;</w:t>
+      </w:r>
+    </w:p>
+    <w:p>
+      <w:r>
+        <w:t xml:space="preserve">        note bottom of Storage</w:t>
+      </w:r>
+    </w:p>
+    <w:p>
+      <w:r>
+        <w:t xml:space="preserve">          - Server-side encryption (SEC-12)</w:t>
+      </w:r>
+    </w:p>
+    <w:p>
+      <w:r>
+        <w:t xml:space="preserve">          - ID images watermarked (SEC-12)</w:t>
+      </w:r>
+    </w:p>
+    <w:p>
+      <w:r>
+        <w:t xml:space="preserve">        end note</w:t>
+      </w:r>
+    </w:p>
+    <w:p>
+      <w:r>
+        <w:t xml:space="preserve">    }</w:t>
+      </w:r>
+    </w:p>
+    <w:p>
+      <w:r>
+        <w:t xml:space="preserve">    </w:t>
+      </w:r>
+    </w:p>
+    <w:p>
+      <w:r>
+        <w:t xml:space="preserve">    package "Messaging" {</w:t>
+      </w:r>
+    </w:p>
+    <w:p>
+      <w:r>
+        <w:t xml:space="preserve">        queue "Kafka / RabbitMQ\n(TLS + SASL)" as Broker &lt;&lt;middleware&gt;&gt;</w:t>
+      </w:r>
+    </w:p>
+    <w:p>
+      <w:r>
+        <w:t xml:space="preserve">        note right of Broker</w:t>
+      </w:r>
+    </w:p>
+    <w:p>
+      <w:r>
+        <w:t xml:space="preserve">          - Encrypted messages at rest</w:t>
+      </w:r>
+    </w:p>
+    <w:p>
+      <w:r>
+        <w:t xml:space="preserve">          - Authentication via SASL</w:t>
+      </w:r>
+    </w:p>
+    <w:p>
+      <w:r>
+        <w:t xml:space="preserve">        end note</w:t>
+      </w:r>
+    </w:p>
+    <w:p>
+      <w:r>
+        <w:t xml:space="preserve">    }</w:t>
+      </w:r>
+    </w:p>
+    <w:p>
+      <w:r>
+        <w:t>}</w:t>
+      </w:r>
+    </w:p>
+    <w:p/>
+    <w:p>
+      <w:r>
+        <w:t>package "External Services" &lt;&lt;external&gt;&gt; {</w:t>
+      </w:r>
+    </w:p>
+    <w:p>
+      <w:r>
+        <w:t xml:space="preserve">    component "Google Maps API" as Maps &lt;&lt;external&gt;&gt;</w:t>
+      </w:r>
+    </w:p>
+    <w:p>
+      <w:r>
+        <w:lastRenderedPageBreak/>
+        <w:t xml:space="preserve">    component "Payment Gateway\n(Stripe/Easypaisa/Jazzcash)" as PayGW &lt;&lt;external&gt;&gt;</w:t>
+      </w:r>
+    </w:p>
+    <w:p>
+      <w:r>
+        <w:t xml:space="preserve">    component "SMS / Email\n(Twilio/SendGrid)" as Notify &lt;&lt;external&gt;&gt;</w:t>
+      </w:r>
+    </w:p>
+    <w:p>
+      <w:r>
+        <w:t>}</w:t>
+      </w:r>
+    </w:p>
+    <w:p/>
+    <w:p>
+      <w:r>
+        <w:t>' ============================</w:t>
+      </w:r>
+    </w:p>
+    <w:p>
+      <w:r>
+        <w:t>' Security Flows &amp; Controls</w:t>
+      </w:r>
+    </w:p>
+    <w:p>
+      <w:r>
+        <w:t>' ============================</w:t>
+      </w:r>
+    </w:p>
+    <w:p/>
+    <w:p>
+      <w:r>
+        <w:t>' Authentication Flow (with password policy &amp; MFA)</w:t>
+      </w:r>
+    </w:p>
+    <w:p>
+      <w:r>
+        <w:t>Cust --&gt; Gateway : **1. Login (Credentials)**\nHTTPS</w:t>
+      </w:r>
+    </w:p>
+    <w:p>
+      <w:r>
+        <w:t>Rider --&gt; Gateway</w:t>
+      </w:r>
+    </w:p>
+    <w:p>
+      <w:r>
+        <w:t>Client --&gt; Gateway</w:t>
+      </w:r>
+    </w:p>
+    <w:p>
+      <w:r>
+        <w:t>note on link : Password policy: min 8 chars, complexity (SEC-07)</w:t>
+      </w:r>
+    </w:p>
+    <w:p>
+      <w:r>
+        <w:t>Gateway --&gt; CustSvc : Validate &amp; Issue JWT + Refresh Token</w:t>
+      </w:r>
+    </w:p>
+    <w:p>
+      <w:r>
+        <w:t>CustSvc --&gt; Notify : OTP for MFA (Client only, SEC-08)</w:t>
+      </w:r>
+    </w:p>
+    <w:p>
+      <w:r>
+        <w:t>note on link : Refresh token rotation on each use (SEC-10)</w:t>
+      </w:r>
+    </w:p>
+    <w:p>
+      <w:r>
+        <w:t>note on link : Account lockout after 5 failures (SEC-11)</w:t>
+      </w:r>
+    </w:p>
+    <w:p/>
+    <w:p>
+      <w:r>
+        <w:t>' Subsequent Requests (JWT Bearer)</w:t>
+      </w:r>
+    </w:p>
+    <w:p>
+      <w:r>
+        <w:t>Cust --&gt; Gateway : **2. API Request + JWT Bearer**\nHTTPS</w:t>
+      </w:r>
+    </w:p>
+    <w:p>
+      <w:r>
+        <w:t>Gateway --&gt; Gateway : Validate JWT Signature &amp; Expiry\n(7d inactivity, 30d absolute)</w:t>
+      </w:r>
+    </w:p>
+    <w:p>
+      <w:r>
+        <w:t>Gateway --&gt; CustSvc : Forward with User Context</w:t>
+      </w:r>
+    </w:p>
+    <w:p/>
+    <w:p>
+      <w:r>
+        <w:t>' Payment Security (PCI DSS)</w:t>
+      </w:r>
+    </w:p>
+    <w:p>
+      <w:r>
+        <w:t>Cust --&gt; Gateway : **3. Payment / Withdrawal Request**\nHTTPS</w:t>
+      </w:r>
+    </w:p>
+    <w:p>
+      <w:r>
+        <w:t>Gateway --&gt; PaySvc : Forward</w:t>
+      </w:r>
+    </w:p>
+    <w:p>
+      <w:r>
+        <w:t>PaySvc --&gt; PayGW : **Tokenized Card Data**\nHTTPS + API Key</w:t>
+      </w:r>
+    </w:p>
+    <w:p>
+      <w:r>
+        <w:t>note on link : No raw PAN/CVV stored (SEC-01–06)</w:t>
+      </w:r>
+    </w:p>
+    <w:p>
+      <w:r>
+        <w:t>note on link : OTP required for withdrawal (SEC-15, SEC-18)</w:t>
+      </w:r>
+    </w:p>
+    <w:p/>
+    <w:p>
+      <w:r>
+        <w:t>' Data Encryption at Rest</w:t>
+      </w:r>
+    </w:p>
+    <w:p>
+      <w:r>
+        <w:t>Postgres --&gt; Postgres : **TDE / File System Encryption**\n(SEC-12)</w:t>
+      </w:r>
+    </w:p>
+    <w:p>
+      <w:r>
+        <w:t>Storage --&gt; Storage : **Server-Side Encryption**\n(SEC-12)</w:t>
+      </w:r>
+    </w:p>
+    <w:p/>
+    <w:p>
+      <w:r>
+        <w:t>' ID Card Watermarking</w:t>
+      </w:r>
+    </w:p>
+    <w:p>
+      <w:r>
+        <w:t>RiderSvc --&gt; Storage : Store ID Card Images</w:t>
+      </w:r>
+    </w:p>
+    <w:p>
+      <w:r>
+        <w:t>note on link : Watermarked &amp; Encrypted (SEC-12)</w:t>
+      </w:r>
+    </w:p>
+    <w:p/>
+    <w:p>
+      <w:r>
+        <w:t>' Audit Logging (Immutable)</w:t>
+      </w:r>
+    </w:p>
+    <w:p>
+      <w:r>
+        <w:t>CustSvc --&gt; ClientSvc : logAction()</w:t>
+      </w:r>
+    </w:p>
+    <w:p>
+      <w:r>
+        <w:t>RiderSvc --&gt; ClientSvc</w:t>
+      </w:r>
+    </w:p>
+    <w:p>
+      <w:r>
+        <w:t>OrderSvc --&gt; ClientSvc</w:t>
+      </w:r>
+    </w:p>
+    <w:p>
+      <w:r>
+        <w:t>TripSvc --&gt; ClientSvc</w:t>
+      </w:r>
+    </w:p>
+    <w:p>
+      <w:r>
+        <w:t>DispatchSvc --&gt; ClientSvc</w:t>
+      </w:r>
+    </w:p>
+    <w:p>
+      <w:r>
+        <w:t>ProdSvc --&gt; ClientSvc</w:t>
+      </w:r>
+    </w:p>
+    <w:p>
+      <w:r>
+        <w:t>FinSvc --&gt; ClientSvc</w:t>
+      </w:r>
+    </w:p>
+    <w:p>
+      <w:r>
+        <w:t>PaySvc --&gt; ClientSvc</w:t>
+      </w:r>
+    </w:p>
+    <w:p>
+      <w:r>
+        <w:t>DiscSvc --&gt; ClientSvc</w:t>
+      </w:r>
+    </w:p>
+    <w:p>
+      <w:r>
+        <w:t>CompSvc --&gt; ClientSvc</w:t>
+      </w:r>
+    </w:p>
+    <w:p>
+      <w:r>
+        <w:t>ClientSvc --&gt; AuditDB : **Immutable Write**\n(1 year retention, SEC-17, SEC-24)</w:t>
+      </w:r>
+    </w:p>
+    <w:p/>
+    <w:p>
+      <w:r>
+        <w:t>' Receipt Security</w:t>
+      </w:r>
+    </w:p>
+    <w:p>
+      <w:r>
+        <w:t>OrderSvc --&gt; Cust : Receipt Image</w:t>
+      </w:r>
+    </w:p>
+    <w:p>
+      <w:r>
+        <w:t>note on link : Signed Barcode (JWT/HMAC, SEC-22)</w:t>
+      </w:r>
+    </w:p>
+    <w:p/>
+    <w:p>
+      <w:r>
+        <w:t>' Live Location Privacy</w:t>
+      </w:r>
+    </w:p>
+    <w:p>
+      <w:r>
+        <w:t>TripSvc --&gt; Redis : Store Location</w:t>
+      </w:r>
+    </w:p>
+    <w:p>
+      <w:r>
+        <w:t>note on link : Only during "Rider Departed" (FR-R-04)\nRetention 24h (SEC-21)</w:t>
+      </w:r>
+    </w:p>
+    <w:p>
+      <w:r>
+        <w:lastRenderedPageBreak/>
+        <w:t>note on link : Route data also retained max 24h (SEC-23)</w:t>
+      </w:r>
+    </w:p>
+    <w:p/>
+    <w:p>
+      <w:r>
+        <w:t>' Rate Limiting &amp; Lockout</w:t>
+      </w:r>
+    </w:p>
+    <w:p>
+      <w:r>
+        <w:t>Attacker --&gt; Gateway : Brute Force Attempt</w:t>
+      </w:r>
+    </w:p>
+    <w:p>
+      <w:r>
+        <w:t>Gateway --&gt; Gateway : **Rate Limit Exceeded** → 429</w:t>
+      </w:r>
+    </w:p>
+    <w:p>
+      <w:r>
+        <w:t>Gateway --&gt; CustSvc : Account Lockout after 5 failures (SEC-11)</w:t>
+      </w:r>
+    </w:p>
+    <w:p/>
+    <w:p>
+      <w:r>
+        <w:t>' Mobile Security Measures</w:t>
+      </w:r>
+    </w:p>
+    <w:p>
+      <w:r>
+        <w:t>note bottom of Cust</w:t>
+      </w:r>
+    </w:p>
+    <w:p>
+      <w:r>
+        <w:t xml:space="preserve">  Mobile App (Capacitor):</w:t>
+      </w:r>
+    </w:p>
+    <w:p>
+      <w:r>
+        <w:t xml:space="preserve">  - Certificate Pinning (SEC-27)</w:t>
+      </w:r>
+    </w:p>
+    <w:p>
+      <w:r>
+        <w:t xml:space="preserve">  - Code Obfuscation (SEC-28)</w:t>
+      </w:r>
+    </w:p>
+    <w:p>
+      <w:r>
+        <w:t xml:space="preserve">  - Root/Jailbreak Detection (SEC-29)</w:t>
+      </w:r>
+    </w:p>
+    <w:p>
+      <w:r>
+        <w:t xml:space="preserve">  - Secure Offline Storage (SEC-30)</w:t>
+      </w:r>
+    </w:p>
+    <w:p>
+      <w:r>
+        <w:t>end note</w:t>
+      </w:r>
+    </w:p>
+    <w:p/>
+    <w:p>
+      <w:r>
+        <w:t>' Consent &amp; Deletion</w:t>
+      </w:r>
+    </w:p>
+    <w:p>
+      <w:r>
+        <w:t>CustSvc --&gt; CustSvc : Record Consent (SEC-13)\nHandle Deletion Requests (SEC-14)</w:t>
+      </w:r>
+    </w:p>
+    <w:p/>
+    <w:p>
+      <w:r>
+        <w:t>' Fraud Monitoring</w:t>
+      </w:r>
+    </w:p>
+    <w:p>
+      <w:r>
+        <w:t>FinSvc --&gt; FinSvc : Fraud Detection Rules (SEC-19)</w:t>
+      </w:r>
+    </w:p>
+    <w:p/>
+    <w:p>
+      <w:r>
+        <w:t>' Breach Notification Plan</w:t>
+      </w:r>
+    </w:p>
+    <w:p>
+      <w:r>
+        <w:t>note bottom of ClientSvc</w:t>
+      </w:r>
+    </w:p>
+    <w:p>
+      <w:r>
+        <w:t xml:space="preserve">  Breach notification process defined (SEC-16)</w:t>
+      </w:r>
+    </w:p>
+    <w:p>
+      <w:r>
+        <w:t xml:space="preserve">  - Notify affected users within 72h</w:t>
+      </w:r>
+    </w:p>
+    <w:p>
+      <w:r>
+        <w:t xml:space="preserve">  - Report to relevant authorities</w:t>
+      </w:r>
+    </w:p>
+    <w:p>
+      <w:r>
+        <w:t>end note</w:t>
+      </w:r>
+    </w:p>
+    <w:p/>
+    <w:p>
+      <w:r>
+        <w:lastRenderedPageBreak/>
+        <w:t>' Operational Security Practices</w:t>
+      </w:r>
+    </w:p>
+    <w:p>
+      <w:r>
+        <w:t>note bottom of Gateway</w:t>
+      </w:r>
+    </w:p>
+    <w:p>
+      <w:r>
+        <w:t xml:space="preserve">  Regular Security Assessments:</w:t>
+      </w:r>
+    </w:p>
+    <w:p>
+      <w:r>
+        <w:t xml:space="preserve">  - Quarterly PCI scans (SEC-06)</w:t>
+      </w:r>
+    </w:p>
+    <w:p>
+      <w:r>
+        <w:t xml:space="preserve">  - Annual penetration testing (NFR-17)</w:t>
+      </w:r>
+    </w:p>
+    <w:p>
+      <w:r>
+        <w:t xml:space="preserve">  - Dependency scanning &amp; patching (NFR-18)</w:t>
+      </w:r>
+    </w:p>
+    <w:p>
+      <w:r>
+        <w:t>end note</w:t>
+      </w:r>
+    </w:p>
+    <w:p/>
+    <w:p>
+      <w:r>
+        <w:t>' ============================</w:t>
+      </w:r>
+    </w:p>
+    <w:p>
+      <w:r>
+        <w:t>' Legend</w:t>
+      </w:r>
+    </w:p>
+    <w:p>
+      <w:r>
+        <w:t>' ============================</w:t>
+      </w:r>
+    </w:p>
+    <w:p>
+      <w:r>
+        <w:t>legend right</w:t>
+      </w:r>
+    </w:p>
+    <w:p>
+      <w:r>
+        <w:t xml:space="preserve">  | Color / Symbol | Meaning |</w:t>
+      </w:r>
+    </w:p>
+    <w:p>
+      <w:r>
+        <w:t xml:space="preserve">  | &lt;#red&gt;   | Threat Actor |</w:t>
+      </w:r>
+    </w:p>
+    <w:p>
+      <w:r>
+        <w:t xml:space="preserve">  | &lt;#green&gt; | Security Control |</w:t>
+      </w:r>
+    </w:p>
+    <w:p>
+      <w:r>
+        <w:t xml:space="preserve">  | **Bold** | Critical Security Flow |</w:t>
+      </w:r>
+    </w:p>
+    <w:p>
+      <w:r>
+        <w:t>endlegend</w:t>
       </w:r>
     </w:p>
     <w:p/>

</xml_diff>

<commit_message>
created CI/CD pipeline diagram
</commit_message>
<xml_diff>
--- a/SDS Document Code.docx
+++ b/SDS Document Code.docx
@@ -39232,6 +39232,1053 @@
     <w:p>
       <w:r>
         <w:t>endlegend</w:t>
+      </w:r>
+    </w:p>
+    <w:p/>
+    <w:p>
+      <w:r>
+        <w:t>@enduml</w:t>
+      </w:r>
+    </w:p>
+    <w:p>
+      <w:pPr>
+        <w:pStyle w:val="Heading1"/>
+      </w:pPr>
+      <w:r>
+        <w:t>CI/CD pipeline diagram</w:t>
+      </w:r>
+    </w:p>
+    <w:p>
+      <w:r>
+        <w:t>@startuml</w:t>
+      </w:r>
+    </w:p>
+    <w:p>
+      <w:r>
+        <w:t>!theme plain</w:t>
+      </w:r>
+    </w:p>
+    <w:p>
+      <w:r>
+        <w:t>title CI/CD Pipeline Diagram – Delivery Platform System (v5.0 – Definitive)</w:t>
+      </w:r>
+    </w:p>
+    <w:p/>
+    <w:p>
+      <w:r>
+        <w:t>' ============================</w:t>
+      </w:r>
+    </w:p>
+    <w:p>
+      <w:r>
+        <w:t>' Source Code Repositories</w:t>
+      </w:r>
+    </w:p>
+    <w:p>
+      <w:r>
+        <w:t>' ============================</w:t>
+      </w:r>
+    </w:p>
+    <w:p>
+      <w:r>
+        <w:t>package "Source Code (Git)" {</w:t>
+      </w:r>
+    </w:p>
+    <w:p>
+      <w:r>
+        <w:t xml:space="preserve">    folder "Backend Services\n(Monorepo, Spring Boot)" as BackendRepo &lt;&lt;repository&gt;&gt; {</w:t>
+      </w:r>
+    </w:p>
+    <w:p>
+      <w:r>
+        <w:lastRenderedPageBreak/>
+        <w:t xml:space="preserve">        file "Customer Service"</w:t>
+      </w:r>
+    </w:p>
+    <w:p>
+      <w:r>
+        <w:t xml:space="preserve">        file "Rider Service"</w:t>
+      </w:r>
+    </w:p>
+    <w:p>
+      <w:r>
+        <w:t xml:space="preserve">        file "Order Service"</w:t>
+      </w:r>
+    </w:p>
+    <w:p>
+      <w:r>
+        <w:t xml:space="preserve">        file "Trip Service"</w:t>
+      </w:r>
+    </w:p>
+    <w:p>
+      <w:r>
+        <w:t xml:space="preserve">        file "... (12+ services)"</w:t>
+      </w:r>
+    </w:p>
+    <w:p>
+      <w:r>
+        <w:t xml:space="preserve">    }</w:t>
+      </w:r>
+    </w:p>
+    <w:p>
+      <w:r>
+        <w:t xml:space="preserve">    folder "Frontend Web\n(Angular)" as WebRepo &lt;&lt;repository&gt;&gt; {</w:t>
+      </w:r>
+    </w:p>
+    <w:p>
+      <w:r>
+        <w:t xml:space="preserve">        file "Customer Web App"</w:t>
+      </w:r>
+    </w:p>
+    <w:p>
+      <w:r>
+        <w:t xml:space="preserve">        file "Admin Dashboard"</w:t>
+      </w:r>
+    </w:p>
+    <w:p>
+      <w:r>
+        <w:t xml:space="preserve">    }</w:t>
+      </w:r>
+    </w:p>
+    <w:p>
+      <w:r>
+        <w:t xml:space="preserve">    folder "Mobile App\n(Angular + Capacitor)" as MobileRepo &lt;&lt;repository&gt;&gt; {</w:t>
+      </w:r>
+    </w:p>
+    <w:p>
+      <w:r>
+        <w:t xml:space="preserve">        file "Rider/Customer App"</w:t>
+      </w:r>
+    </w:p>
+    <w:p>
+      <w:r>
+        <w:t xml:space="preserve">    }</w:t>
+      </w:r>
+    </w:p>
+    <w:p>
+      <w:r>
+        <w:t xml:space="preserve">    folder "Infrastructure\n(Helm Charts, K8s Manifests)" as InfraRepo &lt;&lt;repository&gt;&gt; {</w:t>
+      </w:r>
+    </w:p>
+    <w:p>
+      <w:r>
+        <w:t xml:space="preserve">        file "Values per Environment"</w:t>
+      </w:r>
+    </w:p>
+    <w:p>
+      <w:r>
+        <w:t xml:space="preserve">        file "Terraform (optional)"</w:t>
+      </w:r>
+    </w:p>
+    <w:p>
+      <w:r>
+        <w:t xml:space="preserve">    }</w:t>
+      </w:r>
+    </w:p>
+    <w:p>
+      <w:r>
+        <w:t>}</w:t>
+      </w:r>
+    </w:p>
+    <w:p/>
+    <w:p>
+      <w:r>
+        <w:t>' ============================</w:t>
+      </w:r>
+    </w:p>
+    <w:p>
+      <w:r>
+        <w:t>' CI/CD Server (GitLab CI / GitHub Actions)</w:t>
+      </w:r>
+    </w:p>
+    <w:p>
+      <w:r>
+        <w:t>' ============================</w:t>
+      </w:r>
+    </w:p>
+    <w:p>
+      <w:r>
+        <w:t>node "CI / CD Server" as CICD &lt;&lt;execution environment&gt;&gt; {</w:t>
+      </w:r>
+    </w:p>
+    <w:p>
+      <w:r>
+        <w:t xml:space="preserve">    </w:t>
+      </w:r>
+    </w:p>
+    <w:p>
+      <w:r>
+        <w:t xml:space="preserve">    package "Continuous Integration (CI)" {</w:t>
+      </w:r>
+    </w:p>
+    <w:p>
+      <w:r>
+        <w:t xml:space="preserve">        component "Code Commit Trigger\n(Build only changed services)" as Trigger &lt;&lt;trigger&gt;&gt;</w:t>
+      </w:r>
+    </w:p>
+    <w:p>
+      <w:r>
+        <w:t xml:space="preserve">        component "Static Analysis\n(SonarQube)" as SAST &lt;&lt;security&gt;&gt;</w:t>
+      </w:r>
+    </w:p>
+    <w:p>
+      <w:r>
+        <w:t xml:space="preserve">        component "Unit &amp; Integration Tests\n(JUnit, Mockito, Testcontainers)" as UnitTests &lt;&lt;test&gt;&gt;</w:t>
+      </w:r>
+    </w:p>
+    <w:p>
+      <w:r>
+        <w:t xml:space="preserve">        component "Build &amp; Package\n(Maven / Gradle)" as Build &lt;&lt;build&gt;&gt;</w:t>
+      </w:r>
+    </w:p>
+    <w:p>
+      <w:r>
+        <w:lastRenderedPageBreak/>
+        <w:t xml:space="preserve">        component "Container Image Build\n(Docker, Tag = Git SHA)" as DockerBuild &lt;&lt;build&gt;&gt;</w:t>
+      </w:r>
+    </w:p>
+    <w:p>
+      <w:r>
+        <w:t xml:space="preserve">        component "Container Security Scan\n(Trivy / Snyk)" as ContainerScan &lt;&lt;security&gt;&gt;</w:t>
+      </w:r>
+    </w:p>
+    <w:p>
+      <w:r>
+        <w:t xml:space="preserve">        component "Push to Registry\n(Docker Hub / ECR)" as RegistryPush &lt;&lt;registry&gt;&gt;</w:t>
+      </w:r>
+    </w:p>
+    <w:p>
+      <w:r>
+        <w:t xml:space="preserve">        </w:t>
+      </w:r>
+    </w:p>
+    <w:p>
+      <w:r>
+        <w:t xml:space="preserve">        component "Generate &amp; Publish\nAPI Docs (OpenAPI)" as ApiDocs &lt;&lt;documentation&gt;&gt;</w:t>
+      </w:r>
+    </w:p>
+    <w:p>
+      <w:r>
+        <w:t xml:space="preserve">    }</w:t>
+      </w:r>
+    </w:p>
+    <w:p>
+      <w:r>
+        <w:t xml:space="preserve">    </w:t>
+      </w:r>
+    </w:p>
+    <w:p>
+      <w:r>
+        <w:t xml:space="preserve">    package "Continuous Deployment (CD)" {</w:t>
+      </w:r>
+    </w:p>
+    <w:p>
+      <w:r>
+        <w:t xml:space="preserve">        component "Deploy to Development\n(Helm Upgrade, Dev Namespace)" as DeployDev &lt;&lt;deploy&gt;&gt;</w:t>
+      </w:r>
+    </w:p>
+    <w:p>
+      <w:r>
+        <w:t xml:space="preserve">        component "Integration / E2E Tests\n(Cypress / Newman)" as E2ETests &lt;&lt;test&gt;&gt;</w:t>
+      </w:r>
+    </w:p>
+    <w:p>
+      <w:r>
+        <w:t xml:space="preserve">        component "Deploy to Staging\n(Helm Upgrade, Staging Namespace)" as DeployStaging &lt;&lt;deploy&gt;&gt;</w:t>
+      </w:r>
+    </w:p>
+    <w:p>
+      <w:r>
+        <w:t xml:space="preserve">        component "Smoke Tests" as SmokeTests &lt;&lt;test&gt;&gt;</w:t>
+      </w:r>
+    </w:p>
+    <w:p>
+      <w:r>
+        <w:t xml:space="preserve">        component "Load &amp; Performance Tests\n(k6 / JMeter)" as LoadTests &lt;&lt;test&gt;&gt;</w:t>
+      </w:r>
+    </w:p>
+    <w:p>
+      <w:r>
+        <w:t xml:space="preserve">        component "Update Feature Flags\n(per Environment)" as FeatureFlags &lt;&lt;config&gt;&gt;</w:t>
+      </w:r>
+    </w:p>
+    <w:p>
+      <w:r>
+        <w:t xml:space="preserve">        component "Manual Approval Gate\n(For Production)" as Approval &lt;&lt;gate&gt;&gt;</w:t>
+      </w:r>
+    </w:p>
+    <w:p>
+      <w:r>
+        <w:t xml:space="preserve">        component "Deploy to Production\n(Helm Upgrade, Prod Namespace)" as DeployProd &lt;&lt;deploy&gt;&gt;</w:t>
+      </w:r>
+    </w:p>
+    <w:p>
+      <w:r>
+        <w:t xml:space="preserve">        component "Database Migrations\n(Flyway / Liquibase)" as Migrations &lt;&lt;database&gt;&gt;</w:t>
+      </w:r>
+    </w:p>
+    <w:p>
+      <w:r>
+        <w:t xml:space="preserve">        component "Post</w:t>
+      </w:r>
+      <w:r>
+        <w:rPr>
+          <w:rFonts w:ascii="Cambria Math" w:hAnsi="Cambria Math" w:cs="Cambria Math"/>
+        </w:rPr>
+        <w:t>‑</w:t>
+      </w:r>
+      <w:r>
+        <w:t>Deployment Health Checks" as HealthCheck &lt;&lt;monitor&gt;&gt;</w:t>
+      </w:r>
+    </w:p>
+    <w:p>
+      <w:r>
+        <w:t xml:space="preserve">        component "Automatic Rollback\n(Helm Rollback on Failure)" as Rollback &lt;&lt;recovery&gt;&gt;</w:t>
+      </w:r>
+    </w:p>
+    <w:p>
+      <w:r>
+        <w:t xml:space="preserve">    }</w:t>
+      </w:r>
+    </w:p>
+    <w:p>
+      <w:r>
+        <w:t xml:space="preserve">    </w:t>
+      </w:r>
+    </w:p>
+    <w:p>
+      <w:r>
+        <w:t xml:space="preserve">    component "Notification Service\n(Slack / Email)" as Notify &lt;&lt;notification&gt;&gt;</w:t>
+      </w:r>
+    </w:p>
+    <w:p>
+      <w:r>
+        <w:t>}</w:t>
+      </w:r>
+    </w:p>
+    <w:p/>
+    <w:p>
+      <w:r>
+        <w:t>' ============================</w:t>
+      </w:r>
+    </w:p>
+    <w:p>
+      <w:r>
+        <w:t>' Container Registry</w:t>
+      </w:r>
+    </w:p>
+    <w:p>
+      <w:r>
+        <w:t>' ============================</w:t>
+      </w:r>
+    </w:p>
+    <w:p>
+      <w:r>
+        <w:t>cloud "Container Registry\n(Docker Hub / AWS ECR)" as ContainerRegistry &lt;&lt;registry&gt;&gt;</w:t>
+      </w:r>
+    </w:p>
+    <w:p/>
+    <w:p>
+      <w:r>
+        <w:t>' ============================</w:t>
+      </w:r>
+    </w:p>
+    <w:p>
+      <w:r>
+        <w:t>' Target Environments (Kubernetes)</w:t>
+      </w:r>
+    </w:p>
+    <w:p>
+      <w:r>
+        <w:t>' ============================</w:t>
+      </w:r>
+    </w:p>
+    <w:p>
+      <w:r>
+        <w:t>package "Kubernetes Cluster" {</w:t>
+      </w:r>
+    </w:p>
+    <w:p>
+      <w:r>
+        <w:t xml:space="preserve">    node "Development Namespace" as DevNS &lt;&lt;environment&gt;&gt; {</w:t>
+      </w:r>
+    </w:p>
+    <w:p>
+      <w:r>
+        <w:t xml:space="preserve">        component "Dev Services" as DevSvc</w:t>
+      </w:r>
+    </w:p>
+    <w:p>
+      <w:r>
+        <w:t xml:space="preserve">    }</w:t>
+      </w:r>
+    </w:p>
+    <w:p>
+      <w:r>
+        <w:t xml:space="preserve">    node "Staging Namespace" as StagingNS &lt;&lt;environment&gt;&gt; {</w:t>
+      </w:r>
+    </w:p>
+    <w:p>
+      <w:r>
+        <w:t xml:space="preserve">        component "Staging Services" as StagingSvc</w:t>
+      </w:r>
+    </w:p>
+    <w:p>
+      <w:r>
+        <w:t xml:space="preserve">    }</w:t>
+      </w:r>
+    </w:p>
+    <w:p>
+      <w:r>
+        <w:t xml:space="preserve">    node "Production Namespace" as ProdNS &lt;&lt;environment&gt;&gt; {</w:t>
+      </w:r>
+    </w:p>
+    <w:p>
+      <w:r>
+        <w:t xml:space="preserve">        component "Production Services" as ProdSvc</w:t>
+      </w:r>
+    </w:p>
+    <w:p>
+      <w:r>
+        <w:t xml:space="preserve">        database "Production Databases" as ProdDB &lt;&lt;database&gt;&gt;</w:t>
+      </w:r>
+    </w:p>
+    <w:p>
+      <w:r>
+        <w:t xml:space="preserve">    }</w:t>
+      </w:r>
+    </w:p>
+    <w:p>
+      <w:r>
+        <w:t>}</w:t>
+      </w:r>
+    </w:p>
+    <w:p/>
+    <w:p>
+      <w:r>
+        <w:t>' ============================</w:t>
+      </w:r>
+    </w:p>
+    <w:p>
+      <w:r>
+        <w:t>' Mobile App Distribution</w:t>
+      </w:r>
+    </w:p>
+    <w:p>
+      <w:r>
+        <w:t>' ============================</w:t>
+      </w:r>
+    </w:p>
+    <w:p>
+      <w:r>
+        <w:t>package "Mobile Distribution" {</w:t>
+      </w:r>
+    </w:p>
+    <w:p>
+      <w:r>
+        <w:t xml:space="preserve">    component "Firebase App Distribution\n/ TestFlight" as MobileBeta &lt;&lt;distribution&gt;&gt;</w:t>
+      </w:r>
+    </w:p>
+    <w:p>
+      <w:r>
+        <w:t xml:space="preserve">    component "Google Play Store /\nApple App Store" as AppStores &lt;&lt;distribution&gt;&gt;</w:t>
+      </w:r>
+    </w:p>
+    <w:p>
+      <w:r>
+        <w:t>}</w:t>
+      </w:r>
+    </w:p>
+    <w:p/>
+    <w:p>
+      <w:r>
+        <w:t>' ============================</w:t>
+      </w:r>
+    </w:p>
+    <w:p>
+      <w:r>
+        <w:t>' Pipeline Flow</w:t>
+      </w:r>
+    </w:p>
+    <w:p>
+      <w:r>
+        <w:t>' ============================</w:t>
+      </w:r>
+    </w:p>
+    <w:p/>
+    <w:p>
+      <w:r>
+        <w:lastRenderedPageBreak/>
+        <w:t>' Triggers</w:t>
+      </w:r>
+    </w:p>
+    <w:p>
+      <w:r>
+        <w:t>BackendRepo --&gt; Trigger : git push (service</w:t>
+      </w:r>
+      <w:r>
+        <w:rPr>
+          <w:rFonts w:ascii="Cambria Math" w:hAnsi="Cambria Math" w:cs="Cambria Math"/>
+        </w:rPr>
+        <w:t>‑</w:t>
+      </w:r>
+      <w:r>
+        <w:t>specific changes)</w:t>
+      </w:r>
+    </w:p>
+    <w:p>
+      <w:r>
+        <w:t>WebRepo --&gt; Trigger : git push</w:t>
+      </w:r>
+    </w:p>
+    <w:p>
+      <w:r>
+        <w:t>MobileRepo --&gt; Trigger : git push</w:t>
+      </w:r>
+    </w:p>
+    <w:p>
+      <w:r>
+        <w:t>InfraRepo --&gt; Trigger : git push (starts Helm</w:t>
+      </w:r>
+      <w:r>
+        <w:rPr>
+          <w:rFonts w:ascii="Cambria Math" w:hAnsi="Cambria Math" w:cs="Cambria Math"/>
+        </w:rPr>
+        <w:t>‑</w:t>
+      </w:r>
+      <w:r>
+        <w:t>only deploy)</w:t>
+      </w:r>
+    </w:p>
+    <w:p/>
+    <w:p>
+      <w:r>
+        <w:t>' CI Stage</w:t>
+      </w:r>
+    </w:p>
+    <w:p>
+      <w:r>
+        <w:t>Trigger --&gt; SAST : **1. Static Code Analysis**</w:t>
+      </w:r>
+    </w:p>
+    <w:p>
+      <w:r>
+        <w:t>SAST --&gt; UnitTests : **2. Unit &amp; Integration Tests**</w:t>
+      </w:r>
+    </w:p>
+    <w:p>
+      <w:r>
+        <w:t>UnitTests --&gt; Build : **3. Compile &amp; Package (JAR/WAR)**</w:t>
+      </w:r>
+    </w:p>
+    <w:p>
+      <w:r>
+        <w:t>Build --&gt; DockerBuild : **4. Build Docker Image (tag=Git SHA)**</w:t>
+      </w:r>
+    </w:p>
+    <w:p>
+      <w:r>
+        <w:t>DockerBuild --&gt; ContainerScan : **5. Scan Image for Vulnerabilities**</w:t>
+      </w:r>
+    </w:p>
+    <w:p>
+      <w:r>
+        <w:t>ContainerScan --&gt; RegistryPush : **6. Push Image to Registry**</w:t>
+      </w:r>
+    </w:p>
+    <w:p>
+      <w:r>
+        <w:t>RegistryPush --&gt; ApiDocs : Generate &amp; Publish API Docs</w:t>
+      </w:r>
+    </w:p>
+    <w:p/>
+    <w:p>
+      <w:r>
+        <w:t>' CD Stage – Dev</w:t>
+      </w:r>
+    </w:p>
+    <w:p>
+      <w:r>
+        <w:t>RegistryPush --&gt; DeployDev : **7. Deploy to Dev (auto)**</w:t>
+      </w:r>
+    </w:p>
+    <w:p>
+      <w:r>
+        <w:t>DeployDev --&gt; DevSvc : Helm upgrade with new image tag</w:t>
+      </w:r>
+    </w:p>
+    <w:p>
+      <w:r>
+        <w:t>DeployDev --&gt; E2ETests : **8. Run E2E Tests**</w:t>
+      </w:r>
+    </w:p>
+    <w:p>
+      <w:r>
+        <w:t>E2ETests --&gt; Notify : Test Results</w:t>
+      </w:r>
+    </w:p>
+    <w:p/>
+    <w:p>
+      <w:r>
+        <w:t>' CD Stage – Staging</w:t>
+      </w:r>
+    </w:p>
+    <w:p>
+      <w:r>
+        <w:t>E2ETests --&gt; DeployStaging : **9. Deploy to Staging (auto on success)**</w:t>
+      </w:r>
+    </w:p>
+    <w:p>
+      <w:r>
+        <w:t>DeployStaging --&gt; StagingSvc : Helm upgrade</w:t>
+      </w:r>
+    </w:p>
+    <w:p>
+      <w:r>
+        <w:t>DeployStaging --&gt; SmokeTests : **10. Smoke Tests**</w:t>
+      </w:r>
+    </w:p>
+    <w:p>
+      <w:r>
+        <w:t>SmokeTests --&gt; LoadTests : **11. Load &amp; Performance Tests**</w:t>
+      </w:r>
+    </w:p>
+    <w:p>
+      <w:r>
+        <w:t>LoadTests --&gt; FeatureFlags : **12. Update Feature Flags (if needed)**</w:t>
+      </w:r>
+    </w:p>
+    <w:p>
+      <w:r>
+        <w:t>FeatureFlags --&gt; Approval : **13. Manual Approval Required**</w:t>
+      </w:r>
+    </w:p>
+    <w:p>
+      <w:r>
+        <w:t>Approval --&gt; DeployProd : **14. Approve &amp; Deploy to Production**</w:t>
+      </w:r>
+    </w:p>
+    <w:p>
+      <w:r>
+        <w:lastRenderedPageBreak/>
+        <w:t>DeployProd --&gt; ProdSvc : Helm upgrade</w:t>
+      </w:r>
+    </w:p>
+    <w:p>
+      <w:r>
+        <w:t>DeployProd --&gt; Migrations : Run DB migrations (per service)</w:t>
+      </w:r>
+    </w:p>
+    <w:p>
+      <w:r>
+        <w:t>DeployProd --&gt; HealthCheck : **15. Post</w:t>
+      </w:r>
+      <w:r>
+        <w:rPr>
+          <w:rFonts w:ascii="Cambria Math" w:hAnsi="Cambria Math" w:cs="Cambria Math"/>
+        </w:rPr>
+        <w:t>‑</w:t>
+      </w:r>
+      <w:r>
+        <w:t>Deployment Health Checks**</w:t>
+      </w:r>
+    </w:p>
+    <w:p>
+      <w:r>
+        <w:t>HealthCheck --&gt; Rollback : On failure → auto rollback</w:t>
+      </w:r>
+    </w:p>
+    <w:p>
+      <w:r>
+        <w:t>Rollback --&gt; Notify : Rollback Alert</w:t>
+      </w:r>
+    </w:p>
+    <w:p>
+      <w:r>
+        <w:t>HealthCheck --&gt; Notify : Deployment Success</w:t>
+      </w:r>
+    </w:p>
+    <w:p/>
+    <w:p>
+      <w:r>
+        <w:t>' Mobile App CD (separate track)</w:t>
+      </w:r>
+    </w:p>
+    <w:p>
+      <w:r>
+        <w:t>MobileRepo --&gt; Build : Build Mobile App (Capacitor)</w:t>
+      </w:r>
+    </w:p>
+    <w:p>
+      <w:r>
+        <w:t>Build --&gt; MobileBeta : Deploy Beta (Firebase/TestFlight)</w:t>
+      </w:r>
+    </w:p>
+    <w:p>
+      <w:r>
+        <w:t>MobileBeta --&gt; AppStores : Promote to Production Stores</w:t>
+      </w:r>
+    </w:p>
+    <w:p/>
+    <w:p>
+      <w:r>
+        <w:t>' Infrastructure</w:t>
+      </w:r>
+      <w:r>
+        <w:rPr>
+          <w:rFonts w:ascii="Cambria Math" w:hAnsi="Cambria Math" w:cs="Cambria Math"/>
+        </w:rPr>
+        <w:t>‑</w:t>
+      </w:r>
+      <w:r>
+        <w:t>only deployment (triggered by InfraRepo changes)</w:t>
+      </w:r>
+    </w:p>
+    <w:p>
+      <w:r>
+        <w:t>InfraRepo --&gt; DeployDev : Helm</w:t>
+      </w:r>
+      <w:r>
+        <w:rPr>
+          <w:rFonts w:ascii="Cambria Math" w:hAnsi="Cambria Math" w:cs="Cambria Math"/>
+        </w:rPr>
+        <w:t>‑</w:t>
+      </w:r>
+      <w:r>
+        <w:t>only update (no image build)</w:t>
+      </w:r>
+    </w:p>
+    <w:p/>
+    <w:p>
+      <w:r>
+        <w:t>' Notifications on failures (any stage)</w:t>
+      </w:r>
+    </w:p>
+    <w:p>
+      <w:r>
+        <w:t>SAST ..&gt; Notify : Failure Alert</w:t>
+      </w:r>
+    </w:p>
+    <w:p>
+      <w:r>
+        <w:t>UnitTests ..&gt; Notify : Failure Alert</w:t>
+      </w:r>
+    </w:p>
+    <w:p>
+      <w:r>
+        <w:t>ContainerScan ..&gt; Notify : Failure Alert</w:t>
+      </w:r>
+    </w:p>
+    <w:p>
+      <w:r>
+        <w:t>E2ETests ..&gt; Notify : Failure Alert</w:t>
+      </w:r>
+    </w:p>
+    <w:p>
+      <w:r>
+        <w:t>SmokeTests ..&gt; Notify : Failure Alert</w:t>
+      </w:r>
+    </w:p>
+    <w:p>
+      <w:r>
+        <w:t>LoadTests ..&gt; Notify : Failure Alert</w:t>
+      </w:r>
+    </w:p>
+    <w:p>
+      <w:r>
+        <w:t>HealthCheck ..&gt; Notify : Failure Alert</w:t>
+      </w:r>
+    </w:p>
+    <w:p/>
+    <w:p>
+      <w:r>
+        <w:t>' ============================</w:t>
+      </w:r>
+    </w:p>
+    <w:p>
+      <w:r>
+        <w:t>' Legend &amp; Notes</w:t>
+      </w:r>
+    </w:p>
+    <w:p>
+      <w:r>
+        <w:t>' ============================</w:t>
+      </w:r>
+    </w:p>
+    <w:p>
+      <w:r>
+        <w:t>note top of Trigger</w:t>
+      </w:r>
+    </w:p>
+    <w:p>
+      <w:r>
+        <w:t xml:space="preserve">  Only builds and tests the specific services</w:t>
+      </w:r>
+    </w:p>
+    <w:p>
+      <w:r>
+        <w:lastRenderedPageBreak/>
+        <w:t xml:space="preserve">  or apps that were modified, to keep pipelines</w:t>
+      </w:r>
+    </w:p>
+    <w:p>
+      <w:r>
+        <w:t xml:space="preserve">  fast and efficient (incremental CI).</w:t>
+      </w:r>
+    </w:p>
+    <w:p>
+      <w:r>
+        <w:t>end note</w:t>
+      </w:r>
+    </w:p>
+    <w:p/>
+    <w:p>
+      <w:r>
+        <w:t>note right of ApiDocs</w:t>
+      </w:r>
+    </w:p>
+    <w:p>
+      <w:r>
+        <w:t xml:space="preserve">  Generates OpenAPI 3.0 documentation</w:t>
+      </w:r>
+    </w:p>
+    <w:p>
+      <w:r>
+        <w:t xml:space="preserve">  (SpringDoc) and publishes it to a</w:t>
+      </w:r>
+    </w:p>
+    <w:p>
+      <w:r>
+        <w:t xml:space="preserve">  developer portal or static site.</w:t>
+      </w:r>
+    </w:p>
+    <w:p>
+      <w:r>
+        <w:t xml:space="preserve">  Ensures docs stay in sync with releases (NFR-14).</w:t>
+      </w:r>
+    </w:p>
+    <w:p>
+      <w:r>
+        <w:t>end note</w:t>
+      </w:r>
+    </w:p>
+    <w:p/>
+    <w:p>
+      <w:r>
+        <w:t>note top of LoadTests</w:t>
+      </w:r>
+    </w:p>
+    <w:p>
+      <w:r>
+        <w:t xml:space="preserve">  Validates NFR-01 (&lt;500ms p95),</w:t>
+      </w:r>
+    </w:p>
+    <w:p>
+      <w:r>
+        <w:t xml:space="preserve">  NFR-02 (route calc &lt;2s), and</w:t>
+      </w:r>
+    </w:p>
+    <w:p>
+      <w:r>
+        <w:t xml:space="preserve">  NFR-04 (10k concurrent users).</w:t>
+      </w:r>
+    </w:p>
+    <w:p>
+      <w:r>
+        <w:t xml:space="preserve">  Uses k6 or JMeter scripts stored in repo.</w:t>
+      </w:r>
+    </w:p>
+    <w:p>
+      <w:r>
+        <w:t>end note</w:t>
+      </w:r>
+    </w:p>
+    <w:p/>
+    <w:p>
+      <w:r>
+        <w:t>note top of FeatureFlags</w:t>
+      </w:r>
+    </w:p>
+    <w:p>
+      <w:r>
+        <w:t xml:space="preserve">  Updates feature toggles (NFR-16) for the</w:t>
+      </w:r>
+    </w:p>
+    <w:p>
+      <w:r>
+        <w:t xml:space="preserve">  target environment. Controls discount engine,</w:t>
+      </w:r>
+    </w:p>
+    <w:p>
+      <w:r>
+        <w:t xml:space="preserve">  route algorithm, and payment methods.</w:t>
+      </w:r>
+    </w:p>
+    <w:p>
+      <w:r>
+        <w:t xml:space="preserve">  Uses a centralized feature flag service</w:t>
+      </w:r>
+    </w:p>
+    <w:p>
+      <w:r>
+        <w:t xml:space="preserve">  (e.g., LaunchDarkly or custom).</w:t>
+      </w:r>
+    </w:p>
+    <w:p>
+      <w:r>
+        <w:t>end note</w:t>
+      </w:r>
+    </w:p>
+    <w:p/>
+    <w:p>
+      <w:r>
+        <w:t>note top of Approval</w:t>
+      </w:r>
+    </w:p>
+    <w:p>
+      <w:r>
+        <w:t xml:space="preserve">  Manual approval required before</w:t>
+      </w:r>
+    </w:p>
+    <w:p>
+      <w:r>
+        <w:t xml:space="preserve">  production deployment.</w:t>
+      </w:r>
+    </w:p>
+    <w:p>
+      <w:r>
+        <w:lastRenderedPageBreak/>
+        <w:t xml:space="preserve">  Only Lead Developer / CTO can approve.</w:t>
+      </w:r>
+    </w:p>
+    <w:p>
+      <w:r>
+        <w:t>end note</w:t>
+      </w:r>
+    </w:p>
+    <w:p/>
+    <w:p>
+      <w:r>
+        <w:t>note right of ContainerScan</w:t>
+      </w:r>
+    </w:p>
+    <w:p>
+      <w:r>
+        <w:t xml:space="preserve">  Scans for known CVEs in base images</w:t>
+      </w:r>
+    </w:p>
+    <w:p>
+      <w:r>
+        <w:t xml:space="preserve">  and dependencies. Fails pipeline on</w:t>
+      </w:r>
+    </w:p>
+    <w:p>
+      <w:r>
+        <w:t xml:space="preserve">  HIGH or CRITICAL findings.</w:t>
+      </w:r>
+    </w:p>
+    <w:p>
+      <w:r>
+        <w:t>end note</w:t>
+      </w:r>
+    </w:p>
+    <w:p/>
+    <w:p>
+      <w:r>
+        <w:t>note bottom of DeployProd</w:t>
+      </w:r>
+    </w:p>
+    <w:p>
+      <w:r>
+        <w:t xml:space="preserve">  Uses Rolling Update or Blue/Green</w:t>
+      </w:r>
+    </w:p>
+    <w:p>
+      <w:r>
+        <w:t xml:space="preserve">  deployment strategy to ensure zero</w:t>
+      </w:r>
+    </w:p>
+    <w:p>
+      <w:r>
+        <w:t xml:space="preserve">  downtime (NFR-08: 99.9% uptime).</w:t>
+      </w:r>
+    </w:p>
+    <w:p>
+      <w:r>
+        <w:t xml:space="preserve">  Image tag is immutable Git commit SHA.</w:t>
+      </w:r>
+    </w:p>
+    <w:p>
+      <w:r>
+        <w:t xml:space="preserve">  Secrets are injected from a vault</w:t>
+      </w:r>
+    </w:p>
+    <w:p>
+      <w:r>
+        <w:t xml:space="preserve">  (e.g., HashiCorp Vault) or Kubernetes</w:t>
+      </w:r>
+    </w:p>
+    <w:p>
+      <w:r>
+        <w:t xml:space="preserve">  Secrets – never stored in code.</w:t>
+      </w:r>
+    </w:p>
+    <w:p>
+      <w:r>
+        <w:t>end note</w:t>
+      </w:r>
+    </w:p>
+    <w:p/>
+    <w:p>
+      <w:r>
+        <w:t>note left of MobileBeta</w:t>
+      </w:r>
+    </w:p>
+    <w:p>
+      <w:r>
+        <w:t xml:space="preserve">  Mobile apps follow separate release</w:t>
+      </w:r>
+    </w:p>
+    <w:p>
+      <w:r>
+        <w:t xml:space="preserve">  track with beta testing before store</w:t>
+      </w:r>
+    </w:p>
+    <w:p>
+      <w:r>
+        <w:t xml:space="preserve">  submission.</w:t>
+      </w:r>
+    </w:p>
+    <w:p>
+      <w:r>
+        <w:t>end note</w:t>
+      </w:r>
+    </w:p>
+    <w:p/>
+    <w:p>
+      <w:r>
+        <w:t>note bottom of Rollback</w:t>
+      </w:r>
+    </w:p>
+    <w:p>
+      <w:r>
+        <w:t xml:space="preserve">  If health checks fail, Helm automatically</w:t>
+      </w:r>
+    </w:p>
+    <w:p>
+      <w:r>
+        <w:t xml:space="preserve">  rolls back to the previous stable revision,</w:t>
+      </w:r>
+    </w:p>
+    <w:p>
+      <w:r>
+        <w:t xml:space="preserve">  minimizing impact. Operators are alerted.</w:t>
+      </w:r>
+    </w:p>
+    <w:p>
+      <w:r>
+        <w:lastRenderedPageBreak/>
+        <w:t>end note</w:t>
       </w:r>
     </w:p>
     <w:p/>

</xml_diff>

<commit_message>
created Data Migration - ETL diagram
</commit_message>
<xml_diff>
--- a/SDS Document Code.docx
+++ b/SDS Document Code.docx
@@ -40278,6 +40278,721 @@
     <w:p>
       <w:r>
         <w:lastRenderedPageBreak/>
+        <w:t>end note</w:t>
+      </w:r>
+    </w:p>
+    <w:p/>
+    <w:p>
+      <w:r>
+        <w:t>@enduml</w:t>
+      </w:r>
+    </w:p>
+    <w:p>
+      <w:pPr>
+        <w:pStyle w:val="Heading1"/>
+      </w:pPr>
+      <w:r>
+        <w:t>Data Migration / ETL Diagram</w:t>
+      </w:r>
+    </w:p>
+    <w:p>
+      <w:r>
+        <w:t>@startuml</w:t>
+      </w:r>
+    </w:p>
+    <w:p>
+      <w:r>
+        <w:t>!theme plain</w:t>
+      </w:r>
+    </w:p>
+    <w:p>
+      <w:r>
+        <w:t>title Data Pipeline / ETL for Financial Reporting – Delivery Platform System (v2 – Perfect)</w:t>
+      </w:r>
+    </w:p>
+    <w:p/>
+    <w:p>
+      <w:r>
+        <w:t>' ============================</w:t>
+      </w:r>
+    </w:p>
+    <w:p>
+      <w:r>
+        <w:t>' Source Systems (Operational Databases)</w:t>
+      </w:r>
+    </w:p>
+    <w:p>
+      <w:r>
+        <w:t>' ============================</w:t>
+      </w:r>
+    </w:p>
+    <w:p>
+      <w:r>
+        <w:t>package "Operational Databases\n(Source of Truth)" {</w:t>
+      </w:r>
+    </w:p>
+    <w:p>
+      <w:r>
+        <w:t xml:space="preserve">    database "Order DB\n(Orders, Items, Payments)" as OrderDB &lt;&lt;source&gt;&gt;</w:t>
+      </w:r>
+    </w:p>
+    <w:p>
+      <w:r>
+        <w:t xml:space="preserve">    database "Trip DB\n(Trips, Stops, Fuel Cost)" as TripDB &lt;&lt;source&gt;&gt;</w:t>
+      </w:r>
+    </w:p>
+    <w:p>
+      <w:r>
+        <w:t xml:space="preserve">    database "Rider DB\n(Riders, Wallets, Fines)" as RiderDB &lt;&lt;source&gt;&gt;</w:t>
+      </w:r>
+    </w:p>
+    <w:p>
+      <w:r>
+        <w:t xml:space="preserve">    database "Payment DB\n(Transactions, Payouts)" as PaymentDB &lt;&lt;source&gt;&gt;</w:t>
+      </w:r>
+    </w:p>
+    <w:p>
+      <w:r>
+        <w:t xml:space="preserve">    database "Complaint DB\n(Complaints, Returns)" as ComplaintDB &lt;&lt;source&gt;&gt;</w:t>
+      </w:r>
+    </w:p>
+    <w:p>
+      <w:r>
+        <w:t>}</w:t>
+      </w:r>
+    </w:p>
+    <w:p/>
+    <w:p>
+      <w:r>
+        <w:t>' ============================</w:t>
+      </w:r>
+    </w:p>
+    <w:p>
+      <w:r>
+        <w:t>' Extraction Layer</w:t>
+      </w:r>
+    </w:p>
+    <w:p>
+      <w:r>
+        <w:t>' ============================</w:t>
+      </w:r>
+    </w:p>
+    <w:p>
+      <w:r>
+        <w:t>package "Extract" {</w:t>
+      </w:r>
+    </w:p>
+    <w:p>
+      <w:r>
+        <w:t xml:space="preserve">    component "CDC Listener\n(Debezium / Kafka Connect)" as CDC &lt;&lt;streaming&gt;&gt;</w:t>
+      </w:r>
+    </w:p>
+    <w:p>
+      <w:r>
+        <w:t xml:space="preserve">    component "Scheduled Batch Jobs\n(Quartz in Finance Service)" as BatchExtract &lt;&lt;batch&gt;&gt;</w:t>
+      </w:r>
+    </w:p>
+    <w:p>
+      <w:r>
+        <w:t>}</w:t>
+      </w:r>
+    </w:p>
+    <w:p/>
+    <w:p>
+      <w:r>
+        <w:t>' ============================</w:t>
+      </w:r>
+    </w:p>
+    <w:p>
+      <w:r>
+        <w:t>' Message Broker (Streaming)</w:t>
+      </w:r>
+    </w:p>
+    <w:p>
+      <w:r>
+        <w:lastRenderedPageBreak/>
+        <w:t>' ============================</w:t>
+      </w:r>
+    </w:p>
+    <w:p>
+      <w:r>
+        <w:t>queue "Kafka\n(Topics per Event Type)" as Kafka &lt;&lt;stream&gt;&gt;</w:t>
+      </w:r>
+    </w:p>
+    <w:p/>
+    <w:p>
+      <w:r>
+        <w:t>' ============================</w:t>
+      </w:r>
+    </w:p>
+    <w:p>
+      <w:r>
+        <w:t>' Transformation &amp; Processing</w:t>
+      </w:r>
+    </w:p>
+    <w:p>
+      <w:r>
+        <w:t>' ============================</w:t>
+      </w:r>
+    </w:p>
+    <w:p>
+      <w:r>
+        <w:t>package "Transform &amp; Aggregate\n(Finance Service)" {</w:t>
+      </w:r>
+    </w:p>
+    <w:p>
+      <w:r>
+        <w:t xml:space="preserve">    component "Stream Processor\n(Kafka Streams / Spring Cloud Stream)" as StreamProc &lt;&lt;stream processor&gt;&gt;</w:t>
+      </w:r>
+    </w:p>
+    <w:p>
+      <w:r>
+        <w:t xml:space="preserve">    component "Batch Aggregator\n(Scheduled ETL Logic)" as BatchAgg &lt;&lt;batch processor&gt;&gt;</w:t>
+      </w:r>
+    </w:p>
+    <w:p>
+      <w:r>
+        <w:t xml:space="preserve">    </w:t>
+      </w:r>
+    </w:p>
+    <w:p>
+      <w:r>
+        <w:t xml:space="preserve">    note right of StreamProc</w:t>
+      </w:r>
+    </w:p>
+    <w:p>
+      <w:r>
+        <w:t xml:space="preserve">      Real</w:t>
+      </w:r>
+      <w:r>
+        <w:rPr>
+          <w:rFonts w:ascii="Cambria Math" w:hAnsi="Cambria Math" w:cs="Cambria Math"/>
+        </w:rPr>
+        <w:t>‑</w:t>
+      </w:r>
+      <w:r>
+        <w:t>time aggregation:</w:t>
+      </w:r>
+    </w:p>
+    <w:p>
+      <w:r>
+        <w:t xml:space="preserve">      - Profit per order = (standardFee + commission + hiddenFees) – fuelCost (FR</w:t>
+      </w:r>
+      <w:r>
+        <w:rPr>
+          <w:rFonts w:ascii="Cambria Math" w:hAnsi="Cambria Math" w:cs="Cambria Math"/>
+        </w:rPr>
+        <w:t>‑</w:t>
+      </w:r>
+      <w:r>
+        <w:t>CL</w:t>
+      </w:r>
+      <w:r>
+        <w:rPr>
+          <w:rFonts w:ascii="Cambria Math" w:hAnsi="Cambria Math" w:cs="Cambria Math"/>
+        </w:rPr>
+        <w:t>‑</w:t>
+      </w:r>
+      <w:r>
+        <w:t>19)</w:t>
+      </w:r>
+    </w:p>
+    <w:p>
+      <w:r>
+        <w:t xml:space="preserve">      - Update unpaid profit shares per rider</w:t>
+      </w:r>
+    </w:p>
+    <w:p>
+      <w:r>
+        <w:t xml:space="preserve">      - App treasure balance changes</w:t>
+      </w:r>
+    </w:p>
+    <w:p>
+      <w:r>
+        <w:t xml:space="preserve">    end note</w:t>
+      </w:r>
+    </w:p>
+    <w:p>
+      <w:r>
+        <w:t xml:space="preserve">    </w:t>
+      </w:r>
+    </w:p>
+    <w:p>
+      <w:r>
+        <w:t xml:space="preserve">    note right of BatchAgg</w:t>
+      </w:r>
+    </w:p>
+    <w:p>
+      <w:r>
+        <w:t xml:space="preserve">      Daily / hourly batch reconciliation:</w:t>
+      </w:r>
+    </w:p>
+    <w:p>
+      <w:r>
+        <w:t xml:space="preserve">      - Income Statement (FR</w:t>
+      </w:r>
+      <w:r>
+        <w:rPr>
+          <w:rFonts w:ascii="Cambria Math" w:hAnsi="Cambria Math" w:cs="Cambria Math"/>
+        </w:rPr>
+        <w:t>‑</w:t>
+      </w:r>
+      <w:r>
+        <w:t>CL</w:t>
+      </w:r>
+      <w:r>
+        <w:rPr>
+          <w:rFonts w:ascii="Cambria Math" w:hAnsi="Cambria Math" w:cs="Cambria Math"/>
+        </w:rPr>
+        <w:t>‑</w:t>
+      </w:r>
+      <w:r>
+        <w:t>25)</w:t>
+      </w:r>
+    </w:p>
+    <w:p>
+      <w:r>
+        <w:t xml:space="preserve">      - Balance Sheet</w:t>
+      </w:r>
+    </w:p>
+    <w:p>
+      <w:r>
+        <w:t xml:space="preserve">      - Cash Flow Statement</w:t>
+      </w:r>
+    </w:p>
+    <w:p>
+      <w:r>
+        <w:t xml:space="preserve">      - Base</w:t>
+      </w:r>
+      <w:r>
+        <w:rPr>
+          <w:rFonts w:ascii="Cambria Math" w:hAnsi="Cambria Math" w:cs="Cambria Math"/>
+        </w:rPr>
+        <w:t>‑</w:t>
+      </w:r>
+      <w:r>
+        <w:t>wise Delivery Fee vs Fuel Cost (FR</w:t>
+      </w:r>
+      <w:r>
+        <w:rPr>
+          <w:rFonts w:ascii="Cambria Math" w:hAnsi="Cambria Math" w:cs="Cambria Math"/>
+        </w:rPr>
+        <w:t>‑</w:t>
+      </w:r>
+      <w:r>
+        <w:t>CL</w:t>
+      </w:r>
+      <w:r>
+        <w:rPr>
+          <w:rFonts w:ascii="Cambria Math" w:hAnsi="Cambria Math" w:cs="Cambria Math"/>
+        </w:rPr>
+        <w:t>‑</w:t>
+      </w:r>
+      <w:r>
+        <w:t>15)</w:t>
+      </w:r>
+    </w:p>
+    <w:p>
+      <w:r>
+        <w:t xml:space="preserve">      - Unpaid Profit Shares (FR</w:t>
+      </w:r>
+      <w:r>
+        <w:rPr>
+          <w:rFonts w:ascii="Cambria Math" w:hAnsi="Cambria Math" w:cs="Cambria Math"/>
+        </w:rPr>
+        <w:t>‑</w:t>
+      </w:r>
+      <w:r>
+        <w:t>CL</w:t>
+      </w:r>
+      <w:r>
+        <w:rPr>
+          <w:rFonts w:ascii="Cambria Math" w:hAnsi="Cambria Math" w:cs="Cambria Math"/>
+        </w:rPr>
+        <w:t>‑</w:t>
+      </w:r>
+      <w:r>
+        <w:t>20, FR</w:t>
+      </w:r>
+      <w:r>
+        <w:rPr>
+          <w:rFonts w:ascii="Cambria Math" w:hAnsi="Cambria Math" w:cs="Cambria Math"/>
+        </w:rPr>
+        <w:t>‑</w:t>
+      </w:r>
+      <w:r>
+        <w:t>CL</w:t>
+      </w:r>
+      <w:r>
+        <w:rPr>
+          <w:rFonts w:ascii="Cambria Math" w:hAnsi="Cambria Math" w:cs="Cambria Math"/>
+        </w:rPr>
+        <w:t>‑</w:t>
+      </w:r>
+      <w:r>
+        <w:t>28)</w:t>
+      </w:r>
+    </w:p>
+    <w:p>
+      <w:r>
+        <w:t xml:space="preserve">    end note</w:t>
+      </w:r>
+    </w:p>
+    <w:p>
+      <w:r>
+        <w:t xml:space="preserve">    </w:t>
+      </w:r>
+    </w:p>
+    <w:p>
+      <w:r>
+        <w:t xml:space="preserve">    component "Transformation Rules\n&amp; Validation" as Rules &lt;&lt;config&gt;&gt;</w:t>
+      </w:r>
+    </w:p>
+    <w:p>
+      <w:r>
+        <w:t>}</w:t>
+      </w:r>
+    </w:p>
+    <w:p/>
+    <w:p>
+      <w:r>
+        <w:t>' ============================</w:t>
+      </w:r>
+    </w:p>
+    <w:p>
+      <w:r>
+        <w:t>' Load / Target</w:t>
+      </w:r>
+    </w:p>
+    <w:p>
+      <w:r>
+        <w:t>' ============================</w:t>
+      </w:r>
+    </w:p>
+    <w:p>
+      <w:r>
+        <w:t>package "Finance Data Warehouse\n(Finance DB)" {</w:t>
+      </w:r>
+    </w:p>
+    <w:p>
+      <w:r>
+        <w:t xml:space="preserve">    database "Finance DB\n(Profit Snapshots,\nUnpaid Shares,\nDividend Payments,\nApp Treasure)" as FinanceDB &lt;&lt;target&gt;&gt;</w:t>
+      </w:r>
+    </w:p>
+    <w:p>
+      <w:r>
+        <w:t>}</w:t>
+      </w:r>
+    </w:p>
+    <w:p/>
+    <w:p>
+      <w:r>
+        <w:t>' ============================</w:t>
+      </w:r>
+    </w:p>
+    <w:p>
+      <w:r>
+        <w:t>' Observability &amp; Alerting</w:t>
+      </w:r>
+    </w:p>
+    <w:p>
+      <w:r>
+        <w:t>' ============================</w:t>
+      </w:r>
+    </w:p>
+    <w:p>
+      <w:r>
+        <w:t>component "Notification Service\n(Slack / Email)" as Notify &lt;&lt;alert&gt;&gt;</w:t>
+      </w:r>
+    </w:p>
+    <w:p/>
+    <w:p>
+      <w:r>
+        <w:t>' ============================</w:t>
+      </w:r>
+    </w:p>
+    <w:p>
+      <w:r>
+        <w:t>' Data Flow Connections</w:t>
+      </w:r>
+    </w:p>
+    <w:p>
+      <w:r>
+        <w:t>' ============================</w:t>
+      </w:r>
+    </w:p>
+    <w:p/>
+    <w:p>
+      <w:r>
+        <w:t>' CDC / Streaming Extract</w:t>
+      </w:r>
+    </w:p>
+    <w:p>
+      <w:r>
+        <w:t>OrderDB --&gt; CDC : Change Data Capture</w:t>
+      </w:r>
+    </w:p>
+    <w:p>
+      <w:r>
+        <w:t>TripDB --&gt; CDC</w:t>
+      </w:r>
+    </w:p>
+    <w:p>
+      <w:r>
+        <w:t>RiderDB --&gt; CDC</w:t>
+      </w:r>
+    </w:p>
+    <w:p>
+      <w:r>
+        <w:t>PaymentDB --&gt; CDC</w:t>
+      </w:r>
+    </w:p>
+    <w:p>
+      <w:r>
+        <w:t>ComplaintDB --&gt; CDC</w:t>
+      </w:r>
+    </w:p>
+    <w:p/>
+    <w:p>
+      <w:r>
+        <w:t>CDC --&gt; Kafka : publish events (OrderPlaced, PaymentCompleted, TripCompleted, etc.)</w:t>
+      </w:r>
+    </w:p>
+    <w:p/>
+    <w:p>
+      <w:r>
+        <w:t>' Streaming Processing</w:t>
+      </w:r>
+    </w:p>
+    <w:p>
+      <w:r>
+        <w:t>Kafka --&gt; StreamProc : consume events</w:t>
+      </w:r>
+    </w:p>
+    <w:p>
+      <w:r>
+        <w:lastRenderedPageBreak/>
+        <w:t>StreamProc --&gt; Rules : enrich &amp; validate</w:t>
+      </w:r>
+    </w:p>
+    <w:p>
+      <w:r>
+        <w:t>StreamProc --&gt; FinanceDB : load real</w:t>
+      </w:r>
+      <w:r>
+        <w:rPr>
+          <w:rFonts w:ascii="Cambria Math" w:hAnsi="Cambria Math" w:cs="Cambria Math"/>
+        </w:rPr>
+        <w:t>‑</w:t>
+      </w:r>
+      <w:r>
+        <w:t>time aggregates\n(profit per order, unpaid shares)</w:t>
+      </w:r>
+    </w:p>
+    <w:p/>
+    <w:p>
+      <w:r>
+        <w:t>' Batch Processing</w:t>
+      </w:r>
+    </w:p>
+    <w:p>
+      <w:r>
+        <w:t>BatchExtract --&gt; OrderDB : batch queries (e.g., daily sales totals)</w:t>
+      </w:r>
+    </w:p>
+    <w:p>
+      <w:r>
+        <w:t>BatchExtract --&gt; TripDB</w:t>
+      </w:r>
+    </w:p>
+    <w:p>
+      <w:r>
+        <w:t>BatchExtract --&gt; RiderDB</w:t>
+      </w:r>
+    </w:p>
+    <w:p>
+      <w:r>
+        <w:t>BatchExtract --&gt; PaymentDB</w:t>
+      </w:r>
+    </w:p>
+    <w:p>
+      <w:r>
+        <w:t>BatchExtract --&gt; ComplaintDB</w:t>
+      </w:r>
+    </w:p>
+    <w:p/>
+    <w:p>
+      <w:r>
+        <w:t>BatchExtract --&gt; BatchAgg : raw data</w:t>
+      </w:r>
+    </w:p>
+    <w:p>
+      <w:r>
+        <w:t>BatchAgg --&gt; Rules : transform &amp; reconcile</w:t>
+      </w:r>
+    </w:p>
+    <w:p>
+      <w:r>
+        <w:t>BatchAgg --&gt; FinanceDB : load batch reports\n(invoice statements, base comparisons, etc.)</w:t>
+      </w:r>
+    </w:p>
+    <w:p/>
+    <w:p>
+      <w:r>
+        <w:t>' Alerts on discrepancies or delays</w:t>
+      </w:r>
+    </w:p>
+    <w:p>
+      <w:r>
+        <w:t>StreamProc ..&gt; Notify : alert on processing lag / errors</w:t>
+      </w:r>
+    </w:p>
+    <w:p>
+      <w:r>
+        <w:t>BatchAgg ..&gt; Notify : alert on reconciliation failures</w:t>
+      </w:r>
+    </w:p>
+    <w:p/>
+    <w:p>
+      <w:r>
+        <w:t>' ============================</w:t>
+      </w:r>
+    </w:p>
+    <w:p>
+      <w:r>
+        <w:t>' Notes</w:t>
+      </w:r>
+    </w:p>
+    <w:p>
+      <w:r>
+        <w:t>' ============================</w:t>
+      </w:r>
+    </w:p>
+    <w:p>
+      <w:r>
+        <w:t>note top of CDC</w:t>
+      </w:r>
+    </w:p>
+    <w:p>
+      <w:r>
+        <w:t xml:space="preserve">  Uses Debezium with PostgreSQL logical</w:t>
+      </w:r>
+    </w:p>
+    <w:p>
+      <w:r>
+        <w:t xml:space="preserve">  replication to capture row</w:t>
+      </w:r>
+      <w:r>
+        <w:rPr>
+          <w:rFonts w:ascii="Cambria Math" w:hAnsi="Cambria Math" w:cs="Cambria Math"/>
+        </w:rPr>
+        <w:t>‑</w:t>
+      </w:r>
+      <w:r>
+        <w:t>level changes.</w:t>
+      </w:r>
+    </w:p>
+    <w:p>
+      <w:r>
+        <w:t xml:space="preserve">  Ensures eventual consistency between</w:t>
+      </w:r>
+    </w:p>
+    <w:p>
+      <w:r>
+        <w:t xml:space="preserve">  operational and analytical data.</w:t>
+      </w:r>
+    </w:p>
+    <w:p>
+      <w:r>
+        <w:t>end note</w:t>
+      </w:r>
+    </w:p>
+    <w:p/>
+    <w:p>
+      <w:r>
+        <w:t>note top of BatchExtract</w:t>
+      </w:r>
+    </w:p>
+    <w:p>
+      <w:r>
+        <w:lastRenderedPageBreak/>
+        <w:t xml:space="preserve">  Scheduled via Quartz in the Financial</w:t>
+      </w:r>
+    </w:p>
+    <w:p>
+      <w:r>
+        <w:t xml:space="preserve">  Reporting Service. Runs daily at midnight</w:t>
+      </w:r>
+    </w:p>
+    <w:p>
+      <w:r>
+        <w:t xml:space="preserve">  for full reconciliation and daily reports.</w:t>
+      </w:r>
+    </w:p>
+    <w:p>
+      <w:r>
+        <w:t>end note</w:t>
+      </w:r>
+    </w:p>
+    <w:p/>
+    <w:p>
+      <w:r>
+        <w:t>note right of FinanceDB</w:t>
+      </w:r>
+    </w:p>
+    <w:p>
+      <w:r>
+        <w:t xml:space="preserve">  Designed for analytical queries.</w:t>
+      </w:r>
+    </w:p>
+    <w:p>
+      <w:r>
+        <w:t xml:space="preserve">  Contains aggregated profit snapshots,</w:t>
+      </w:r>
+    </w:p>
+    <w:p>
+      <w:r>
+        <w:t xml:space="preserve">  unpaid profit shares per rider,</w:t>
+      </w:r>
+    </w:p>
+    <w:p>
+      <w:r>
+        <w:t xml:space="preserve">  dividend distribution records,</w:t>
+      </w:r>
+    </w:p>
+    <w:p>
+      <w:r>
+        <w:t xml:space="preserve">  and App Treasure transaction history.</w:t>
+      </w:r>
+    </w:p>
+    <w:p>
+      <w:r>
+        <w:t>end note</w:t>
+      </w:r>
+    </w:p>
+    <w:p/>
+    <w:p>
+      <w:r>
+        <w:t>note bottom of Kafka</w:t>
+      </w:r>
+    </w:p>
+    <w:p>
+      <w:r>
+        <w:t xml:space="preserve">  Reliable, durable event log.</w:t>
+      </w:r>
+    </w:p>
+    <w:p>
+      <w:r>
+        <w:t xml:space="preserve">  Retains data for 7 days to allow</w:t>
+      </w:r>
+    </w:p>
+    <w:p>
+      <w:r>
+        <w:t xml:space="preserve">  replay in case of failures.</w:t>
+      </w:r>
+    </w:p>
+    <w:p>
+      <w:r>
         <w:t>end note</w:t>
       </w:r>
     </w:p>

</xml_diff>